<commit_message>
Cap nhat huong dan
</commit_message>
<xml_diff>
--- a/Quy_trinh.docx
+++ b/Quy_trinh.docx
@@ -4,8 +4,22 @@
   <w:body>
     <w:p>
       <w:pPr>
+        <w:keepNext w:val="0"/>
+        <w:keepLines w:val="0"/>
+        <w:pageBreakBefore w:val="0"/>
+        <w:widowControl/>
+        <w:kinsoku/>
+        <w:wordWrap/>
+        <w:overflowPunct/>
+        <w:topLinePunct w:val="0"/>
+        <w:autoSpaceDE/>
+        <w:autoSpaceDN/>
         <w:bidi w:val="0"/>
+        <w:adjustRightInd/>
+        <w:snapToGrid/>
+        <w:spacing w:line="360" w:lineRule="auto"/>
         <w:jc w:val="center"/>
+        <w:textAlignment w:val="auto"/>
         <w:rPr>
           <w:rFonts w:hint="default" w:ascii="Times New Roman" w:hAnsi="Times New Roman" w:cs="Times New Roman"/>
           <w:b/>
@@ -27,12 +41,27 @@
     </w:p>
     <w:p>
       <w:pPr>
+        <w:keepNext w:val="0"/>
+        <w:keepLines w:val="0"/>
+        <w:pageBreakBefore w:val="0"/>
+        <w:widowControl/>
         <w:numPr>
           <w:ilvl w:val="0"/>
           <w:numId w:val="11"/>
         </w:numPr>
+        <w:kinsoku/>
+        <w:wordWrap/>
+        <w:overflowPunct/>
+        <w:topLinePunct w:val="0"/>
+        <w:autoSpaceDE/>
+        <w:autoSpaceDN/>
         <w:bidi w:val="0"/>
+        <w:adjustRightInd/>
+        <w:snapToGrid/>
+        <w:spacing w:line="360" w:lineRule="auto"/>
         <w:ind w:left="425" w:leftChars="0" w:hanging="425" w:firstLineChars="0"/>
+        <w:jc w:val="both"/>
+        <w:textAlignment w:val="auto"/>
         <w:rPr>
           <w:rFonts w:hint="default" w:ascii="Times New Roman" w:hAnsi="Times New Roman" w:cs="Times New Roman"/>
           <w:b/>
@@ -54,7 +83,22 @@
     </w:p>
     <w:p>
       <w:pPr>
+        <w:keepNext w:val="0"/>
+        <w:keepLines w:val="0"/>
+        <w:pageBreakBefore w:val="0"/>
+        <w:widowControl/>
+        <w:kinsoku/>
+        <w:wordWrap/>
+        <w:overflowPunct/>
+        <w:topLinePunct w:val="0"/>
+        <w:autoSpaceDE/>
+        <w:autoSpaceDN/>
         <w:bidi w:val="0"/>
+        <w:adjustRightInd/>
+        <w:snapToGrid/>
+        <w:spacing w:line="360" w:lineRule="auto"/>
+        <w:jc w:val="both"/>
+        <w:textAlignment w:val="auto"/>
         <w:rPr>
           <w:rFonts w:hint="default" w:ascii="Times New Roman" w:hAnsi="Times New Roman" w:cs="Times New Roman"/>
           <w:sz w:val="24"/>
@@ -89,7 +133,22 @@
     </w:p>
     <w:p>
       <w:pPr>
+        <w:keepNext w:val="0"/>
+        <w:keepLines w:val="0"/>
+        <w:pageBreakBefore w:val="0"/>
+        <w:widowControl/>
+        <w:kinsoku/>
+        <w:wordWrap/>
+        <w:overflowPunct/>
+        <w:topLinePunct w:val="0"/>
+        <w:autoSpaceDE/>
+        <w:autoSpaceDN/>
         <w:bidi w:val="0"/>
+        <w:adjustRightInd/>
+        <w:snapToGrid/>
+        <w:spacing w:line="360" w:lineRule="auto"/>
+        <w:jc w:val="both"/>
+        <w:textAlignment w:val="auto"/>
         <w:rPr>
           <w:rFonts w:hint="default" w:ascii="Times New Roman" w:hAnsi="Times New Roman" w:cs="Times New Roman"/>
           <w:sz w:val="24"/>
@@ -126,12 +185,27 @@
     </w:p>
     <w:p>
       <w:pPr>
+        <w:keepNext w:val="0"/>
+        <w:keepLines w:val="0"/>
+        <w:pageBreakBefore w:val="0"/>
+        <w:widowControl/>
         <w:numPr>
           <w:ilvl w:val="0"/>
           <w:numId w:val="11"/>
         </w:numPr>
+        <w:kinsoku/>
+        <w:wordWrap/>
+        <w:overflowPunct/>
+        <w:topLinePunct w:val="0"/>
+        <w:autoSpaceDE/>
+        <w:autoSpaceDN/>
         <w:bidi w:val="0"/>
+        <w:adjustRightInd/>
+        <w:snapToGrid/>
+        <w:spacing w:line="360" w:lineRule="auto"/>
         <w:ind w:left="425" w:leftChars="0" w:hanging="425" w:firstLineChars="0"/>
+        <w:jc w:val="both"/>
+        <w:textAlignment w:val="auto"/>
         <w:rPr>
           <w:rFonts w:hint="default" w:ascii="Times New Roman" w:hAnsi="Times New Roman" w:cs="Times New Roman"/>
           <w:b/>
@@ -155,11 +229,27 @@
     </w:p>
     <w:p>
       <w:pPr>
+        <w:keepNext w:val="0"/>
+        <w:keepLines w:val="0"/>
+        <w:pageBreakBefore w:val="0"/>
+        <w:widowControl/>
+        <w:kinsoku/>
+        <w:wordWrap/>
+        <w:overflowPunct/>
+        <w:topLinePunct w:val="0"/>
+        <w:autoSpaceDE/>
+        <w:autoSpaceDN/>
         <w:bidi w:val="0"/>
+        <w:adjustRightInd/>
+        <w:snapToGrid/>
+        <w:spacing w:line="360" w:lineRule="auto"/>
+        <w:jc w:val="both"/>
+        <w:textAlignment w:val="auto"/>
         <w:rPr>
           <w:rFonts w:hint="default" w:ascii="Times New Roman" w:hAnsi="Times New Roman" w:cs="Times New Roman"/>
           <w:sz w:val="24"/>
           <w:szCs w:val="24"/>
+          <w:lang w:val="vi-VN"/>
         </w:rPr>
       </w:pPr>
       <w:r>
@@ -179,12 +269,2510 @@
         </w:rPr>
         <w:t>hiết kế Rubik 3D → lập trình xoay → quản lý trạng thái → tích hợp solver → kiểm thử trong Unity → chuẩn bị Android → export Unity → tạo Flutter → tích hợp Unity vào Flutter → xây dựng giao diện → giao tiếp Flutter và Unity → build APK → kiểm thử thiết bị thật → tối ưu hiệu năng và dung lượng.</w:t>
       </w:r>
+    </w:p>
+    <w:p>
+      <w:pPr>
+        <w:keepNext w:val="0"/>
+        <w:keepLines w:val="0"/>
+        <w:pageBreakBefore w:val="0"/>
+        <w:widowControl/>
+        <w:numPr>
+          <w:ilvl w:val="0"/>
+          <w:numId w:val="11"/>
+        </w:numPr>
+        <w:kinsoku/>
+        <w:wordWrap/>
+        <w:overflowPunct/>
+        <w:topLinePunct w:val="0"/>
+        <w:autoSpaceDE/>
+        <w:autoSpaceDN/>
+        <w:bidi w:val="0"/>
+        <w:adjustRightInd/>
+        <w:snapToGrid/>
+        <w:spacing w:line="360" w:lineRule="auto"/>
+        <w:ind w:left="425" w:leftChars="0" w:hanging="425" w:firstLineChars="0"/>
+        <w:jc w:val="both"/>
+        <w:textAlignment w:val="auto"/>
+        <w:rPr>
+          <w:rFonts w:hint="default" w:ascii="Times New Roman" w:hAnsi="Times New Roman" w:cs="Times New Roman"/>
+          <w:b/>
+          <w:bCs/>
+          <w:sz w:val="24"/>
+          <w:szCs w:val="24"/>
+          <w:lang w:val="vi-VN"/>
+        </w:rPr>
+      </w:pPr>
+      <w:r>
+        <w:rPr>
+          <w:rFonts w:hint="default" w:ascii="Times New Roman" w:hAnsi="Times New Roman" w:cs="Times New Roman"/>
+          <w:b/>
+          <w:bCs/>
+          <w:sz w:val="24"/>
+          <w:szCs w:val="24"/>
+          <w:lang w:val="vi-VN"/>
+        </w:rPr>
+        <w:t>Lưu ý</w:t>
+      </w:r>
+    </w:p>
+    <w:p>
+      <w:pPr>
+        <w:keepNext w:val="0"/>
+        <w:keepLines w:val="0"/>
+        <w:pageBreakBefore w:val="0"/>
+        <w:widowControl/>
+        <w:numPr>
+          <w:numId w:val="0"/>
+        </w:numPr>
+        <w:kinsoku/>
+        <w:wordWrap/>
+        <w:overflowPunct/>
+        <w:topLinePunct w:val="0"/>
+        <w:autoSpaceDE/>
+        <w:autoSpaceDN/>
+        <w:bidi w:val="0"/>
+        <w:adjustRightInd/>
+        <w:snapToGrid/>
+        <w:spacing w:line="360" w:lineRule="auto"/>
+        <w:ind w:leftChars="0"/>
+        <w:jc w:val="both"/>
+        <w:textAlignment w:val="auto"/>
+        <w:rPr>
+          <w:rFonts w:hint="default" w:ascii="Times New Roman" w:hAnsi="Times New Roman" w:cs="Times New Roman"/>
+          <w:b w:val="0"/>
+          <w:bCs w:val="0"/>
+          <w:sz w:val="24"/>
+          <w:szCs w:val="24"/>
+          <w:lang w:val="vi-VN"/>
+        </w:rPr>
+      </w:pPr>
+      <w:r>
+        <w:rPr>
+          <w:rFonts w:hint="default" w:ascii="Times New Roman" w:hAnsi="Times New Roman" w:cs="Times New Roman"/>
+          <w:b w:val="0"/>
+          <w:bCs w:val="0"/>
+          <w:sz w:val="24"/>
+          <w:szCs w:val="24"/>
+          <w:lang w:val="vi-VN"/>
+        </w:rPr>
+        <w:t xml:space="preserve">Unity phiên bản </w:t>
+      </w:r>
+      <w:r>
+        <w:rPr>
+          <w:rFonts w:hint="default" w:ascii="Times New Roman" w:hAnsi="Times New Roman" w:cs="Times New Roman"/>
+          <w:sz w:val="24"/>
+          <w:szCs w:val="24"/>
+        </w:rPr>
+        <w:t xml:space="preserve"> 6000.6.2f1</w:t>
+      </w:r>
+      <w:r>
+        <w:rPr>
+          <w:rFonts w:hint="default" w:ascii="Times New Roman" w:hAnsi="Times New Roman" w:cs="Times New Roman"/>
+          <w:sz w:val="24"/>
+          <w:szCs w:val="24"/>
+          <w:lang w:val="vi-VN"/>
+        </w:rPr>
+        <w:t xml:space="preserve"> </w:t>
+      </w:r>
+      <w:r>
+        <w:rPr>
+          <w:rFonts w:hint="default" w:ascii="Times New Roman" w:hAnsi="Times New Roman" w:cs="Times New Roman"/>
+          <w:b w:val="0"/>
+          <w:bCs w:val="0"/>
+          <w:sz w:val="24"/>
+          <w:szCs w:val="24"/>
+          <w:lang w:val="vi-VN"/>
+        </w:rPr>
+        <w:t>chỉ hỗ trợ trên thiết bị di động có kiến trúc ARM.</w:t>
+      </w:r>
+    </w:p>
+    <w:p>
+      <w:pPr>
+        <w:keepNext w:val="0"/>
+        <w:keepLines w:val="0"/>
+        <w:pageBreakBefore w:val="0"/>
+        <w:widowControl/>
+        <w:numPr>
+          <w:numId w:val="0"/>
+        </w:numPr>
+        <w:kinsoku/>
+        <w:wordWrap/>
+        <w:overflowPunct/>
+        <w:topLinePunct w:val="0"/>
+        <w:autoSpaceDE/>
+        <w:autoSpaceDN/>
+        <w:bidi w:val="0"/>
+        <w:adjustRightInd/>
+        <w:snapToGrid/>
+        <w:spacing w:line="360" w:lineRule="auto"/>
+        <w:ind w:leftChars="0"/>
+        <w:jc w:val="both"/>
+        <w:textAlignment w:val="auto"/>
+        <w:rPr>
+          <w:rFonts w:hint="default" w:ascii="Times New Roman" w:hAnsi="Times New Roman" w:cs="Times New Roman"/>
+          <w:b w:val="0"/>
+          <w:bCs w:val="0"/>
+          <w:sz w:val="24"/>
+          <w:szCs w:val="24"/>
+          <w:lang w:val="vi-VN"/>
+        </w:rPr>
+      </w:pPr>
+      <w:r>
+        <w:rPr>
+          <w:rFonts w:hint="default" w:ascii="Times New Roman" w:hAnsi="Times New Roman" w:cs="Times New Roman"/>
+          <w:b w:val="0"/>
+          <w:bCs w:val="0"/>
+          <w:sz w:val="24"/>
+          <w:szCs w:val="24"/>
+          <w:lang w:val="vi-VN"/>
+        </w:rPr>
+        <w:t>Đảm bảm phiên bản SDK cả Unity và Android Studio cùng phiên bản.</w:t>
+      </w:r>
+    </w:p>
+    <w:p>
+      <w:pPr>
+        <w:keepNext w:val="0"/>
+        <w:keepLines w:val="0"/>
+        <w:pageBreakBefore w:val="0"/>
+        <w:widowControl/>
+        <w:numPr>
+          <w:ilvl w:val="0"/>
+          <w:numId w:val="11"/>
+        </w:numPr>
+        <w:kinsoku/>
+        <w:wordWrap/>
+        <w:overflowPunct/>
+        <w:topLinePunct w:val="0"/>
+        <w:autoSpaceDE/>
+        <w:autoSpaceDN/>
+        <w:bidi w:val="0"/>
+        <w:adjustRightInd/>
+        <w:snapToGrid/>
+        <w:spacing w:line="360" w:lineRule="auto"/>
+        <w:ind w:left="425" w:leftChars="0" w:hanging="425" w:firstLineChars="0"/>
+        <w:jc w:val="both"/>
+        <w:textAlignment w:val="auto"/>
+        <w:rPr>
+          <w:rFonts w:hint="default" w:ascii="Times New Roman" w:hAnsi="Times New Roman" w:cs="Times New Roman"/>
+          <w:b/>
+          <w:bCs/>
+          <w:sz w:val="24"/>
+          <w:szCs w:val="24"/>
+          <w:lang w:val="vi-VN"/>
+        </w:rPr>
+      </w:pPr>
+      <w:r>
+        <w:rPr>
+          <w:rFonts w:hint="default" w:ascii="Times New Roman" w:hAnsi="Times New Roman" w:cs="Times New Roman"/>
+          <w:b/>
+          <w:bCs/>
+          <w:sz w:val="24"/>
+          <w:szCs w:val="24"/>
+          <w:lang w:val="vi-VN"/>
+        </w:rPr>
+        <w:t>Chi tiết cái bước thiết kế</w:t>
+      </w:r>
+    </w:p>
+    <w:p>
+      <w:pPr>
+        <w:keepNext w:val="0"/>
+        <w:keepLines w:val="0"/>
+        <w:pageBreakBefore w:val="0"/>
+        <w:widowControl/>
+        <w:suppressLineNumbers w:val="0"/>
+        <w:kinsoku/>
+        <w:wordWrap/>
+        <w:overflowPunct/>
+        <w:topLinePunct w:val="0"/>
+        <w:autoSpaceDE/>
+        <w:autoSpaceDN/>
+        <w:bidi w:val="0"/>
+        <w:adjustRightInd/>
+        <w:snapToGrid/>
+        <w:spacing w:line="360" w:lineRule="auto"/>
+        <w:jc w:val="both"/>
+        <w:textAlignment w:val="auto"/>
+        <w:rPr>
+          <w:rFonts w:hint="default" w:ascii="Times New Roman" w:hAnsi="Times New Roman" w:cs="Times New Roman"/>
+          <w:b/>
+          <w:bCs/>
+          <w:sz w:val="24"/>
+          <w:szCs w:val="24"/>
+        </w:rPr>
+      </w:pPr>
+      <w:r>
+        <w:rPr>
+          <w:rFonts w:hint="default" w:ascii="Times New Roman" w:hAnsi="Times New Roman" w:eastAsia="SimSun" w:cs="Times New Roman"/>
+          <w:b/>
+          <w:bCs/>
+          <w:kern w:val="0"/>
+          <w:sz w:val="24"/>
+          <w:szCs w:val="24"/>
+          <w:lang w:val="en-US" w:eastAsia="zh-CN" w:bidi="ar"/>
+        </w:rPr>
+        <w:t>Thiết kế Rubik 3D (3D Modeling &amp; Asset Creation)</w:t>
+      </w:r>
+    </w:p>
+    <w:p>
+      <w:pPr>
+        <w:keepNext w:val="0"/>
+        <w:keepLines w:val="0"/>
+        <w:pageBreakBefore w:val="0"/>
+        <w:widowControl/>
+        <w:numPr>
+          <w:ilvl w:val="0"/>
+          <w:numId w:val="12"/>
+        </w:numPr>
+        <w:suppressLineNumbers w:val="0"/>
+        <w:tabs>
+          <w:tab w:val="clear" w:pos="420"/>
+        </w:tabs>
+        <w:kinsoku/>
+        <w:wordWrap/>
+        <w:overflowPunct/>
+        <w:topLinePunct w:val="0"/>
+        <w:autoSpaceDE/>
+        <w:autoSpaceDN/>
+        <w:bidi w:val="0"/>
+        <w:adjustRightInd/>
+        <w:snapToGrid/>
+        <w:spacing w:line="360" w:lineRule="auto"/>
+        <w:ind w:left="418" w:leftChars="0" w:hanging="309" w:firstLineChars="0"/>
+        <w:jc w:val="both"/>
+        <w:textAlignment w:val="auto"/>
+        <w:rPr>
+          <w:rFonts w:hint="default" w:ascii="Times New Roman" w:hAnsi="Times New Roman" w:cs="Times New Roman"/>
+          <w:sz w:val="24"/>
+          <w:szCs w:val="24"/>
+        </w:rPr>
+      </w:pPr>
+      <w:r>
+        <w:rPr>
+          <w:rFonts w:hint="default" w:ascii="Times New Roman" w:hAnsi="Times New Roman" w:eastAsia="SimSun" w:cs="Times New Roman"/>
+          <w:kern w:val="0"/>
+          <w:sz w:val="24"/>
+          <w:szCs w:val="24"/>
+          <w:lang w:val="en-US" w:eastAsia="zh-CN" w:bidi="ar"/>
+        </w:rPr>
+        <w:t>Bước 1: Tạo model 27 khối lập phương nhỏ (Cubies) trong Blender hoặc Maya với kích thước và góc bo (Bevel) chuẩn.</w:t>
+      </w:r>
+    </w:p>
+    <w:p>
+      <w:pPr>
+        <w:keepNext w:val="0"/>
+        <w:keepLines w:val="0"/>
+        <w:pageBreakBefore w:val="0"/>
+        <w:widowControl/>
+        <w:numPr>
+          <w:ilvl w:val="0"/>
+          <w:numId w:val="12"/>
+        </w:numPr>
+        <w:suppressLineNumbers w:val="0"/>
+        <w:tabs>
+          <w:tab w:val="clear" w:pos="420"/>
+        </w:tabs>
+        <w:kinsoku/>
+        <w:wordWrap/>
+        <w:overflowPunct/>
+        <w:topLinePunct w:val="0"/>
+        <w:autoSpaceDE/>
+        <w:autoSpaceDN/>
+        <w:bidi w:val="0"/>
+        <w:adjustRightInd/>
+        <w:snapToGrid/>
+        <w:spacing w:line="360" w:lineRule="auto"/>
+        <w:ind w:left="418" w:leftChars="0" w:hanging="309" w:firstLineChars="0"/>
+        <w:jc w:val="both"/>
+        <w:textAlignment w:val="auto"/>
+        <w:rPr>
+          <w:rFonts w:hint="default" w:ascii="Times New Roman" w:hAnsi="Times New Roman" w:cs="Times New Roman"/>
+          <w:sz w:val="24"/>
+          <w:szCs w:val="24"/>
+        </w:rPr>
+      </w:pPr>
+      <w:r>
+        <w:rPr>
+          <w:rFonts w:hint="default" w:ascii="Times New Roman" w:hAnsi="Times New Roman" w:eastAsia="SimSun" w:cs="Times New Roman"/>
+          <w:kern w:val="0"/>
+          <w:sz w:val="24"/>
+          <w:szCs w:val="24"/>
+          <w:lang w:val="en-US" w:eastAsia="zh-CN" w:bidi="ar"/>
+        </w:rPr>
+        <w:t>Bước 2: Đánh dấu và trải UV Map cho các mặt của khối Rubik.</w:t>
+      </w:r>
+    </w:p>
+    <w:p>
+      <w:pPr>
+        <w:keepNext w:val="0"/>
+        <w:keepLines w:val="0"/>
+        <w:pageBreakBefore w:val="0"/>
+        <w:widowControl/>
+        <w:numPr>
+          <w:ilvl w:val="0"/>
+          <w:numId w:val="12"/>
+        </w:numPr>
+        <w:suppressLineNumbers w:val="0"/>
+        <w:tabs>
+          <w:tab w:val="clear" w:pos="420"/>
+        </w:tabs>
+        <w:kinsoku/>
+        <w:wordWrap/>
+        <w:overflowPunct/>
+        <w:topLinePunct w:val="0"/>
+        <w:autoSpaceDE/>
+        <w:autoSpaceDN/>
+        <w:bidi w:val="0"/>
+        <w:adjustRightInd/>
+        <w:snapToGrid/>
+        <w:spacing w:line="360" w:lineRule="auto"/>
+        <w:ind w:left="418" w:leftChars="0" w:hanging="309" w:firstLineChars="0"/>
+        <w:jc w:val="both"/>
+        <w:textAlignment w:val="auto"/>
+        <w:rPr>
+          <w:rFonts w:hint="default" w:ascii="Times New Roman" w:hAnsi="Times New Roman" w:cs="Times New Roman"/>
+          <w:sz w:val="24"/>
+          <w:szCs w:val="24"/>
+        </w:rPr>
+      </w:pPr>
+      <w:r>
+        <w:rPr>
+          <w:rFonts w:hint="default" w:ascii="Times New Roman" w:hAnsi="Times New Roman" w:eastAsia="SimSun" w:cs="Times New Roman"/>
+          <w:kern w:val="0"/>
+          <w:sz w:val="24"/>
+          <w:szCs w:val="24"/>
+          <w:lang w:val="en-US" w:eastAsia="zh-CN" w:bidi="ar"/>
+        </w:rPr>
+        <w:t>Bước 3: Tạo Material và gán màu chuẩn (Trắng, Vàng, Cam, Đỏ, Xanh lá, Xanh dương) cho từng mặt.</w:t>
+      </w:r>
+    </w:p>
+    <w:p>
+      <w:pPr>
+        <w:keepNext w:val="0"/>
+        <w:keepLines w:val="0"/>
+        <w:pageBreakBefore w:val="0"/>
+        <w:widowControl/>
+        <w:numPr>
+          <w:ilvl w:val="0"/>
+          <w:numId w:val="12"/>
+        </w:numPr>
+        <w:suppressLineNumbers w:val="0"/>
+        <w:tabs>
+          <w:tab w:val="clear" w:pos="420"/>
+        </w:tabs>
+        <w:kinsoku/>
+        <w:wordWrap/>
+        <w:overflowPunct/>
+        <w:topLinePunct w:val="0"/>
+        <w:autoSpaceDE/>
+        <w:autoSpaceDN/>
+        <w:bidi w:val="0"/>
+        <w:adjustRightInd/>
+        <w:snapToGrid/>
+        <w:spacing w:line="360" w:lineRule="auto"/>
+        <w:ind w:left="418" w:leftChars="0" w:hanging="309" w:firstLineChars="0"/>
+        <w:jc w:val="both"/>
+        <w:textAlignment w:val="auto"/>
+        <w:rPr>
+          <w:rFonts w:hint="default" w:ascii="Times New Roman" w:hAnsi="Times New Roman" w:cs="Times New Roman"/>
+          <w:sz w:val="24"/>
+          <w:szCs w:val="24"/>
+        </w:rPr>
+      </w:pPr>
+      <w:r>
+        <w:rPr>
+          <w:rFonts w:hint="default" w:ascii="Times New Roman" w:hAnsi="Times New Roman" w:eastAsia="SimSun" w:cs="Times New Roman"/>
+          <w:kern w:val="0"/>
+          <w:sz w:val="24"/>
+          <w:szCs w:val="24"/>
+          <w:lang w:val="en-US" w:eastAsia="zh-CN" w:bidi="ar"/>
+        </w:rPr>
+        <w:t>Bước 4: Thiết lập hệ trục tọa độ Pivot Point của từng Cubie về chính tâm (0,0,0) của khối Rubik tổng.</w:t>
+      </w:r>
+    </w:p>
+    <w:p>
+      <w:pPr>
+        <w:keepNext w:val="0"/>
+        <w:keepLines w:val="0"/>
+        <w:pageBreakBefore w:val="0"/>
+        <w:widowControl/>
+        <w:numPr>
+          <w:ilvl w:val="0"/>
+          <w:numId w:val="12"/>
+        </w:numPr>
+        <w:suppressLineNumbers w:val="0"/>
+        <w:tabs>
+          <w:tab w:val="clear" w:pos="420"/>
+        </w:tabs>
+        <w:kinsoku/>
+        <w:wordWrap/>
+        <w:overflowPunct/>
+        <w:topLinePunct w:val="0"/>
+        <w:autoSpaceDE/>
+        <w:autoSpaceDN/>
+        <w:bidi w:val="0"/>
+        <w:adjustRightInd/>
+        <w:snapToGrid/>
+        <w:spacing w:line="360" w:lineRule="auto"/>
+        <w:ind w:left="418" w:leftChars="0" w:hanging="309" w:firstLineChars="0"/>
+        <w:jc w:val="both"/>
+        <w:textAlignment w:val="auto"/>
+        <w:rPr>
+          <w:rFonts w:hint="default" w:ascii="Times New Roman" w:hAnsi="Times New Roman" w:eastAsia="SimSun" w:cs="Times New Roman"/>
+          <w:kern w:val="0"/>
+          <w:sz w:val="24"/>
+          <w:szCs w:val="24"/>
+          <w:lang w:val="en-US" w:eastAsia="zh-CN" w:bidi="ar"/>
+        </w:rPr>
+      </w:pPr>
+      <w:r>
+        <w:rPr>
+          <w:rFonts w:hint="default" w:ascii="Times New Roman" w:hAnsi="Times New Roman" w:eastAsia="SimSun" w:cs="Times New Roman"/>
+          <w:kern w:val="0"/>
+          <w:sz w:val="24"/>
+          <w:szCs w:val="24"/>
+          <w:lang w:val="en-US" w:eastAsia="zh-CN" w:bidi="ar"/>
+        </w:rPr>
+        <w:t>Bước 5: Export mô hình sang định dạng .fbx hoặc .obj kèm Texture/Material.</w:t>
+      </w:r>
+    </w:p>
+    <w:p>
+      <w:pPr>
+        <w:keepNext w:val="0"/>
+        <w:keepLines w:val="0"/>
+        <w:pageBreakBefore w:val="0"/>
+        <w:widowControl/>
+        <w:suppressLineNumbers w:val="0"/>
+        <w:kinsoku/>
+        <w:wordWrap/>
+        <w:overflowPunct/>
+        <w:topLinePunct w:val="0"/>
+        <w:autoSpaceDE/>
+        <w:autoSpaceDN/>
+        <w:bidi w:val="0"/>
+        <w:adjustRightInd/>
+        <w:snapToGrid/>
+        <w:spacing w:line="360" w:lineRule="auto"/>
+        <w:jc w:val="both"/>
+        <w:textAlignment w:val="auto"/>
+        <w:rPr>
+          <w:rFonts w:hint="default" w:ascii="Times New Roman" w:hAnsi="Times New Roman" w:cs="Times New Roman"/>
+          <w:b/>
+          <w:bCs/>
+          <w:sz w:val="24"/>
+          <w:szCs w:val="24"/>
+        </w:rPr>
+      </w:pPr>
+      <w:r>
+        <w:rPr>
+          <w:rFonts w:hint="default" w:ascii="Times New Roman" w:hAnsi="Times New Roman" w:eastAsia="SimSun" w:cs="Times New Roman"/>
+          <w:b/>
+          <w:bCs/>
+          <w:kern w:val="0"/>
+          <w:sz w:val="24"/>
+          <w:szCs w:val="24"/>
+          <w:lang w:val="en-US" w:eastAsia="zh-CN" w:bidi="ar"/>
+        </w:rPr>
+        <w:t> Lập trình xoay (Core Rotation Mechanics)</w:t>
+      </w:r>
+    </w:p>
+    <w:p>
+      <w:pPr>
+        <w:keepNext w:val="0"/>
+        <w:keepLines w:val="0"/>
+        <w:pageBreakBefore w:val="0"/>
+        <w:widowControl/>
+        <w:numPr>
+          <w:ilvl w:val="0"/>
+          <w:numId w:val="12"/>
+        </w:numPr>
+        <w:suppressLineNumbers w:val="0"/>
+        <w:kinsoku/>
+        <w:wordWrap/>
+        <w:overflowPunct/>
+        <w:topLinePunct w:val="0"/>
+        <w:autoSpaceDE/>
+        <w:autoSpaceDN/>
+        <w:bidi w:val="0"/>
+        <w:adjustRightInd/>
+        <w:snapToGrid/>
+        <w:spacing w:line="360" w:lineRule="auto"/>
+        <w:ind w:left="418" w:leftChars="0" w:hanging="309" w:firstLineChars="0"/>
+        <w:jc w:val="both"/>
+        <w:textAlignment w:val="auto"/>
+        <w:rPr>
+          <w:rFonts w:hint="default" w:ascii="Times New Roman" w:hAnsi="Times New Roman" w:cs="Times New Roman"/>
+          <w:sz w:val="24"/>
+          <w:szCs w:val="24"/>
+        </w:rPr>
+      </w:pPr>
+      <w:r>
+        <w:rPr>
+          <w:rFonts w:hint="default" w:ascii="Times New Roman" w:hAnsi="Times New Roman" w:eastAsia="SimSun" w:cs="Times New Roman"/>
+          <w:kern w:val="0"/>
+          <w:sz w:val="24"/>
+          <w:szCs w:val="24"/>
+          <w:lang w:val="en-US" w:eastAsia="zh-CN" w:bidi="ar"/>
+        </w:rPr>
+        <w:t>Bước 1: Import file .fbx vào Unity và thiết lập Hierarchy lưu trữ 27 Cubies.</w:t>
+      </w:r>
+    </w:p>
+    <w:p>
+      <w:pPr>
+        <w:keepNext w:val="0"/>
+        <w:keepLines w:val="0"/>
+        <w:pageBreakBefore w:val="0"/>
+        <w:widowControl/>
+        <w:numPr>
+          <w:ilvl w:val="0"/>
+          <w:numId w:val="12"/>
+        </w:numPr>
+        <w:suppressLineNumbers w:val="0"/>
+        <w:kinsoku/>
+        <w:wordWrap/>
+        <w:overflowPunct/>
+        <w:topLinePunct w:val="0"/>
+        <w:autoSpaceDE/>
+        <w:autoSpaceDN/>
+        <w:bidi w:val="0"/>
+        <w:adjustRightInd/>
+        <w:snapToGrid/>
+        <w:spacing w:line="360" w:lineRule="auto"/>
+        <w:ind w:left="418" w:leftChars="0" w:hanging="309" w:firstLineChars="0"/>
+        <w:jc w:val="both"/>
+        <w:textAlignment w:val="auto"/>
+        <w:rPr>
+          <w:rFonts w:hint="default" w:ascii="Times New Roman" w:hAnsi="Times New Roman" w:cs="Times New Roman"/>
+          <w:sz w:val="24"/>
+          <w:szCs w:val="24"/>
+        </w:rPr>
+      </w:pPr>
+      <w:r>
+        <w:rPr>
+          <w:rFonts w:hint="default" w:ascii="Times New Roman" w:hAnsi="Times New Roman" w:eastAsia="SimSun" w:cs="Times New Roman"/>
+          <w:kern w:val="0"/>
+          <w:sz w:val="24"/>
+          <w:szCs w:val="24"/>
+          <w:lang w:val="en-US" w:eastAsia="zh-CN" w:bidi="ar"/>
+        </w:rPr>
+        <w:t>Bước 2: Xây dựng thuật toán Raycast (hoặc Touch Gesture) để xác định mặt Rubik và hướng vuốt của người dùng.</w:t>
+      </w:r>
+    </w:p>
+    <w:p>
+      <w:pPr>
+        <w:keepNext w:val="0"/>
+        <w:keepLines w:val="0"/>
+        <w:pageBreakBefore w:val="0"/>
+        <w:widowControl/>
+        <w:numPr>
+          <w:ilvl w:val="0"/>
+          <w:numId w:val="12"/>
+        </w:numPr>
+        <w:suppressLineNumbers w:val="0"/>
+        <w:kinsoku/>
+        <w:wordWrap/>
+        <w:overflowPunct/>
+        <w:topLinePunct w:val="0"/>
+        <w:autoSpaceDE/>
+        <w:autoSpaceDN/>
+        <w:bidi w:val="0"/>
+        <w:adjustRightInd/>
+        <w:snapToGrid/>
+        <w:spacing w:line="360" w:lineRule="auto"/>
+        <w:ind w:left="418" w:leftChars="0" w:hanging="309" w:firstLineChars="0"/>
+        <w:jc w:val="both"/>
+        <w:textAlignment w:val="auto"/>
+        <w:rPr>
+          <w:rFonts w:hint="default" w:ascii="Times New Roman" w:hAnsi="Times New Roman" w:cs="Times New Roman"/>
+          <w:sz w:val="24"/>
+          <w:szCs w:val="24"/>
+        </w:rPr>
+      </w:pPr>
+      <w:r>
+        <w:rPr>
+          <w:rFonts w:hint="default" w:ascii="Times New Roman" w:hAnsi="Times New Roman" w:eastAsia="SimSun" w:cs="Times New Roman"/>
+          <w:kern w:val="0"/>
+          <w:sz w:val="24"/>
+          <w:szCs w:val="24"/>
+          <w:lang w:val="en-US" w:eastAsia="zh-CN" w:bidi="ar"/>
+        </w:rPr>
+        <w:t>Bước 3: Tạo Pivot GameObject trung gian tại tâm để gom nhóm 9 Cubies thuộc tầng/mặt được chọn.</w:t>
+      </w:r>
+    </w:p>
+    <w:p>
+      <w:pPr>
+        <w:keepNext w:val="0"/>
+        <w:keepLines w:val="0"/>
+        <w:pageBreakBefore w:val="0"/>
+        <w:widowControl/>
+        <w:numPr>
+          <w:ilvl w:val="0"/>
+          <w:numId w:val="12"/>
+        </w:numPr>
+        <w:suppressLineNumbers w:val="0"/>
+        <w:kinsoku/>
+        <w:wordWrap/>
+        <w:overflowPunct/>
+        <w:topLinePunct w:val="0"/>
+        <w:autoSpaceDE/>
+        <w:autoSpaceDN/>
+        <w:bidi w:val="0"/>
+        <w:adjustRightInd/>
+        <w:snapToGrid/>
+        <w:spacing w:line="360" w:lineRule="auto"/>
+        <w:ind w:left="418" w:leftChars="0" w:hanging="309" w:firstLineChars="0"/>
+        <w:jc w:val="both"/>
+        <w:textAlignment w:val="auto"/>
+        <w:rPr>
+          <w:rFonts w:hint="default" w:ascii="Times New Roman" w:hAnsi="Times New Roman" w:cs="Times New Roman"/>
+          <w:sz w:val="24"/>
+          <w:szCs w:val="24"/>
+        </w:rPr>
+      </w:pPr>
+      <w:r>
+        <w:rPr>
+          <w:rFonts w:hint="default" w:ascii="Times New Roman" w:hAnsi="Times New Roman" w:eastAsia="SimSun" w:cs="Times New Roman"/>
+          <w:kern w:val="0"/>
+          <w:sz w:val="24"/>
+          <w:szCs w:val="24"/>
+          <w:lang w:val="en-US" w:eastAsia="zh-CN" w:bidi="ar"/>
+        </w:rPr>
+        <w:t>Bước 4: Lập trình xoay Pivot GameObject một góc 90 độ mượt mà bằng Quaternion.Slerp hoặc LeanTween/DOTween.</w:t>
+      </w:r>
+    </w:p>
+    <w:p>
+      <w:pPr>
+        <w:keepNext w:val="0"/>
+        <w:keepLines w:val="0"/>
+        <w:pageBreakBefore w:val="0"/>
+        <w:widowControl/>
+        <w:numPr>
+          <w:ilvl w:val="0"/>
+          <w:numId w:val="12"/>
+        </w:numPr>
+        <w:suppressLineNumbers w:val="0"/>
+        <w:kinsoku/>
+        <w:wordWrap/>
+        <w:overflowPunct/>
+        <w:topLinePunct w:val="0"/>
+        <w:autoSpaceDE/>
+        <w:autoSpaceDN/>
+        <w:bidi w:val="0"/>
+        <w:adjustRightInd/>
+        <w:snapToGrid/>
+        <w:spacing w:line="360" w:lineRule="auto"/>
+        <w:ind w:left="418" w:leftChars="0" w:hanging="309" w:firstLineChars="0"/>
+        <w:jc w:val="both"/>
+        <w:textAlignment w:val="auto"/>
+        <w:rPr>
+          <w:rFonts w:hint="default" w:ascii="Times New Roman" w:hAnsi="Times New Roman" w:cs="Times New Roman"/>
+          <w:sz w:val="24"/>
+          <w:szCs w:val="24"/>
+        </w:rPr>
+      </w:pPr>
+      <w:r>
+        <w:rPr>
+          <w:rFonts w:hint="default" w:ascii="Times New Roman" w:hAnsi="Times New Roman" w:eastAsia="SimSun" w:cs="Times New Roman"/>
+          <w:kern w:val="0"/>
+          <w:sz w:val="24"/>
+          <w:szCs w:val="24"/>
+          <w:lang w:val="en-US" w:eastAsia="zh-CN" w:bidi="ar"/>
+        </w:rPr>
+        <w:t>Bước 5: Unparent (nhả) 9 Cubies khỏi Pivot GameObject và cập nhật lại vị trí/góc xoay thế giới của từng Cubie.</w:t>
+      </w:r>
+    </w:p>
+    <w:p>
+      <w:pPr>
+        <w:keepNext w:val="0"/>
+        <w:keepLines w:val="0"/>
+        <w:pageBreakBefore w:val="0"/>
+        <w:widowControl/>
+        <w:suppressLineNumbers w:val="0"/>
+        <w:kinsoku/>
+        <w:wordWrap/>
+        <w:overflowPunct/>
+        <w:topLinePunct w:val="0"/>
+        <w:autoSpaceDE/>
+        <w:autoSpaceDN/>
+        <w:bidi w:val="0"/>
+        <w:adjustRightInd/>
+        <w:snapToGrid/>
+        <w:spacing w:line="360" w:lineRule="auto"/>
+        <w:jc w:val="both"/>
+        <w:textAlignment w:val="auto"/>
+        <w:rPr>
+          <w:rFonts w:hint="default" w:ascii="Times New Roman" w:hAnsi="Times New Roman" w:cs="Times New Roman"/>
+          <w:b/>
+          <w:bCs/>
+          <w:sz w:val="24"/>
+          <w:szCs w:val="24"/>
+        </w:rPr>
+      </w:pPr>
+      <w:r>
+        <w:rPr>
+          <w:rFonts w:hint="default" w:ascii="Times New Roman" w:hAnsi="Times New Roman" w:eastAsia="SimSun" w:cs="Times New Roman"/>
+          <w:b/>
+          <w:bCs/>
+          <w:kern w:val="0"/>
+          <w:sz w:val="24"/>
+          <w:szCs w:val="24"/>
+          <w:lang w:val="en-US" w:eastAsia="zh-CN" w:bidi="ar"/>
+        </w:rPr>
+        <w:t>Quản lý trạng thái (State Management &amp; Logic)</w:t>
+      </w:r>
+    </w:p>
+    <w:p>
+      <w:pPr>
+        <w:keepNext w:val="0"/>
+        <w:keepLines w:val="0"/>
+        <w:pageBreakBefore w:val="0"/>
+        <w:widowControl/>
+        <w:numPr>
+          <w:ilvl w:val="0"/>
+          <w:numId w:val="12"/>
+        </w:numPr>
+        <w:suppressLineNumbers w:val="0"/>
+        <w:kinsoku/>
+        <w:wordWrap/>
+        <w:overflowPunct/>
+        <w:topLinePunct w:val="0"/>
+        <w:autoSpaceDE/>
+        <w:autoSpaceDN/>
+        <w:bidi w:val="0"/>
+        <w:adjustRightInd/>
+        <w:snapToGrid/>
+        <w:spacing w:line="360" w:lineRule="auto"/>
+        <w:ind w:left="418" w:leftChars="0" w:hanging="309" w:firstLineChars="0"/>
+        <w:jc w:val="both"/>
+        <w:textAlignment w:val="auto"/>
+        <w:rPr>
+          <w:rFonts w:hint="default" w:ascii="Times New Roman" w:hAnsi="Times New Roman" w:cs="Times New Roman"/>
+          <w:sz w:val="24"/>
+          <w:szCs w:val="24"/>
+        </w:rPr>
+      </w:pPr>
+      <w:r>
+        <w:rPr>
+          <w:rFonts w:hint="default" w:ascii="Times New Roman" w:hAnsi="Times New Roman" w:eastAsia="SimSun" w:cs="Times New Roman"/>
+          <w:kern w:val="0"/>
+          <w:sz w:val="24"/>
+          <w:szCs w:val="24"/>
+          <w:lang w:val="en-US" w:eastAsia="zh-CN" w:bidi="ar"/>
+        </w:rPr>
+        <w:t>Bước 1: Định nghĩa mô hình dữ liệu biểu diễn khối Rubik (Mảng 3D, Mảng 1D 54 mặt, hoặc String trạng thái).</w:t>
+      </w:r>
+    </w:p>
+    <w:p>
+      <w:pPr>
+        <w:keepNext w:val="0"/>
+        <w:keepLines w:val="0"/>
+        <w:pageBreakBefore w:val="0"/>
+        <w:widowControl/>
+        <w:numPr>
+          <w:ilvl w:val="0"/>
+          <w:numId w:val="12"/>
+        </w:numPr>
+        <w:suppressLineNumbers w:val="0"/>
+        <w:kinsoku/>
+        <w:wordWrap/>
+        <w:overflowPunct/>
+        <w:topLinePunct w:val="0"/>
+        <w:autoSpaceDE/>
+        <w:autoSpaceDN/>
+        <w:bidi w:val="0"/>
+        <w:adjustRightInd/>
+        <w:snapToGrid/>
+        <w:spacing w:line="360" w:lineRule="auto"/>
+        <w:ind w:left="418" w:leftChars="0" w:hanging="309" w:firstLineChars="0"/>
+        <w:jc w:val="both"/>
+        <w:textAlignment w:val="auto"/>
+        <w:rPr>
+          <w:rFonts w:hint="default" w:ascii="Times New Roman" w:hAnsi="Times New Roman" w:cs="Times New Roman"/>
+          <w:sz w:val="24"/>
+          <w:szCs w:val="24"/>
+        </w:rPr>
+      </w:pPr>
+      <w:r>
+        <w:rPr>
+          <w:rFonts w:hint="default" w:ascii="Times New Roman" w:hAnsi="Times New Roman" w:eastAsia="SimSun" w:cs="Times New Roman"/>
+          <w:kern w:val="0"/>
+          <w:sz w:val="24"/>
+          <w:szCs w:val="24"/>
+          <w:lang w:val="en-US" w:eastAsia="zh-CN" w:bidi="ar"/>
+        </w:rPr>
+        <w:t>Bước 2: Lập trình bộ quy đổi hành động xoay trên giao diện 3D thành ký hiệu chuẩn Singmaster (R, L, U, D, F, B, R', ...).</w:t>
+      </w:r>
+    </w:p>
+    <w:p>
+      <w:pPr>
+        <w:keepNext w:val="0"/>
+        <w:keepLines w:val="0"/>
+        <w:pageBreakBefore w:val="0"/>
+        <w:widowControl/>
+        <w:numPr>
+          <w:ilvl w:val="0"/>
+          <w:numId w:val="12"/>
+        </w:numPr>
+        <w:suppressLineNumbers w:val="0"/>
+        <w:kinsoku/>
+        <w:wordWrap/>
+        <w:overflowPunct/>
+        <w:topLinePunct w:val="0"/>
+        <w:autoSpaceDE/>
+        <w:autoSpaceDN/>
+        <w:bidi w:val="0"/>
+        <w:adjustRightInd/>
+        <w:snapToGrid/>
+        <w:spacing w:line="360" w:lineRule="auto"/>
+        <w:ind w:left="418" w:leftChars="0" w:hanging="309" w:firstLineChars="0"/>
+        <w:jc w:val="both"/>
+        <w:textAlignment w:val="auto"/>
+        <w:rPr>
+          <w:rFonts w:hint="default" w:ascii="Times New Roman" w:hAnsi="Times New Roman" w:cs="Times New Roman"/>
+          <w:sz w:val="24"/>
+          <w:szCs w:val="24"/>
+        </w:rPr>
+      </w:pPr>
+      <w:r>
+        <w:rPr>
+          <w:rFonts w:hint="default" w:ascii="Times New Roman" w:hAnsi="Times New Roman" w:eastAsia="SimSun" w:cs="Times New Roman"/>
+          <w:kern w:val="0"/>
+          <w:sz w:val="24"/>
+          <w:szCs w:val="24"/>
+          <w:lang w:val="en-US" w:eastAsia="zh-CN" w:bidi="ar"/>
+        </w:rPr>
+        <w:t>Bước 3: Cập nhật mảng trạng thái ma trận Rubik ngay sau khi hoàn thành mỗi lượt xoay 90 độ.</w:t>
+      </w:r>
+    </w:p>
+    <w:p>
+      <w:pPr>
+        <w:keepNext w:val="0"/>
+        <w:keepLines w:val="0"/>
+        <w:pageBreakBefore w:val="0"/>
+        <w:widowControl/>
+        <w:numPr>
+          <w:ilvl w:val="0"/>
+          <w:numId w:val="12"/>
+        </w:numPr>
+        <w:suppressLineNumbers w:val="0"/>
+        <w:kinsoku/>
+        <w:wordWrap/>
+        <w:overflowPunct/>
+        <w:topLinePunct w:val="0"/>
+        <w:autoSpaceDE/>
+        <w:autoSpaceDN/>
+        <w:bidi w:val="0"/>
+        <w:adjustRightInd/>
+        <w:snapToGrid/>
+        <w:spacing w:line="360" w:lineRule="auto"/>
+        <w:ind w:left="418" w:leftChars="0" w:hanging="309" w:firstLineChars="0"/>
+        <w:jc w:val="both"/>
+        <w:textAlignment w:val="auto"/>
+        <w:rPr>
+          <w:rFonts w:hint="default" w:ascii="Times New Roman" w:hAnsi="Times New Roman" w:cs="Times New Roman"/>
+          <w:sz w:val="24"/>
+          <w:szCs w:val="24"/>
+        </w:rPr>
+      </w:pPr>
+      <w:r>
+        <w:rPr>
+          <w:rFonts w:hint="default" w:ascii="Times New Roman" w:hAnsi="Times New Roman" w:eastAsia="SimSun" w:cs="Times New Roman"/>
+          <w:kern w:val="0"/>
+          <w:sz w:val="24"/>
+          <w:szCs w:val="24"/>
+          <w:lang w:val="en-US" w:eastAsia="zh-CN" w:bidi="ar"/>
+        </w:rPr>
+        <w:t>Bước 4: Lập trình tính năng Xáo trộn (Scramble) bằng cách sinh chuỗi ngẫu nhiên các nước đi chuẩn và thực thi tự động.</w:t>
+      </w:r>
+    </w:p>
+    <w:p>
+      <w:pPr>
+        <w:keepNext w:val="0"/>
+        <w:keepLines w:val="0"/>
+        <w:pageBreakBefore w:val="0"/>
+        <w:widowControl/>
+        <w:numPr>
+          <w:ilvl w:val="0"/>
+          <w:numId w:val="12"/>
+        </w:numPr>
+        <w:suppressLineNumbers w:val="0"/>
+        <w:kinsoku/>
+        <w:wordWrap/>
+        <w:overflowPunct/>
+        <w:topLinePunct w:val="0"/>
+        <w:autoSpaceDE/>
+        <w:autoSpaceDN/>
+        <w:bidi w:val="0"/>
+        <w:adjustRightInd/>
+        <w:snapToGrid/>
+        <w:spacing w:line="360" w:lineRule="auto"/>
+        <w:ind w:left="418" w:leftChars="0" w:hanging="309" w:firstLineChars="0"/>
+        <w:jc w:val="both"/>
+        <w:textAlignment w:val="auto"/>
+        <w:rPr>
+          <w:rFonts w:hint="default" w:ascii="Times New Roman" w:hAnsi="Times New Roman" w:cs="Times New Roman"/>
+          <w:sz w:val="24"/>
+          <w:szCs w:val="24"/>
+        </w:rPr>
+      </w:pPr>
+      <w:r>
+        <w:rPr>
+          <w:rFonts w:hint="default" w:ascii="Times New Roman" w:hAnsi="Times New Roman" w:eastAsia="SimSun" w:cs="Times New Roman"/>
+          <w:kern w:val="0"/>
+          <w:sz w:val="24"/>
+          <w:szCs w:val="24"/>
+          <w:lang w:val="en-US" w:eastAsia="zh-CN" w:bidi="ar"/>
+        </w:rPr>
+        <w:t>Bước 5: Lập trình tính năng Reset để đưa dữ liệu ma trận và vị trí 3D về trạng thái hoàn chỉnh ban đầu.</w:t>
+      </w:r>
+    </w:p>
+    <w:p>
+      <w:pPr>
+        <w:keepNext w:val="0"/>
+        <w:keepLines w:val="0"/>
+        <w:pageBreakBefore w:val="0"/>
+        <w:widowControl/>
+        <w:suppressLineNumbers w:val="0"/>
+        <w:kinsoku/>
+        <w:wordWrap/>
+        <w:overflowPunct/>
+        <w:topLinePunct w:val="0"/>
+        <w:autoSpaceDE/>
+        <w:autoSpaceDN/>
+        <w:bidi w:val="0"/>
+        <w:adjustRightInd/>
+        <w:snapToGrid/>
+        <w:spacing w:line="360" w:lineRule="auto"/>
+        <w:jc w:val="both"/>
+        <w:textAlignment w:val="auto"/>
+        <w:rPr>
+          <w:rFonts w:hint="default" w:ascii="Times New Roman" w:hAnsi="Times New Roman" w:cs="Times New Roman"/>
+          <w:b/>
+          <w:bCs/>
+          <w:sz w:val="24"/>
+          <w:szCs w:val="24"/>
+        </w:rPr>
+      </w:pPr>
+      <w:r>
+        <w:rPr>
+          <w:rFonts w:hint="default" w:ascii="Times New Roman" w:hAnsi="Times New Roman" w:eastAsia="SimSun" w:cs="Times New Roman"/>
+          <w:b/>
+          <w:bCs/>
+          <w:kern w:val="0"/>
+          <w:sz w:val="24"/>
+          <w:szCs w:val="24"/>
+          <w:lang w:val="en-US" w:eastAsia="zh-CN" w:bidi="ar"/>
+        </w:rPr>
+        <w:t>Tích hợp Solver (Thư viện giải Rubik)</w:t>
+      </w:r>
+    </w:p>
+    <w:p>
+      <w:pPr>
+        <w:keepNext w:val="0"/>
+        <w:keepLines w:val="0"/>
+        <w:pageBreakBefore w:val="0"/>
+        <w:widowControl/>
+        <w:numPr>
+          <w:ilvl w:val="0"/>
+          <w:numId w:val="12"/>
+        </w:numPr>
+        <w:suppressLineNumbers w:val="0"/>
+        <w:kinsoku/>
+        <w:wordWrap/>
+        <w:overflowPunct/>
+        <w:topLinePunct w:val="0"/>
+        <w:autoSpaceDE/>
+        <w:autoSpaceDN/>
+        <w:bidi w:val="0"/>
+        <w:adjustRightInd/>
+        <w:snapToGrid/>
+        <w:spacing w:line="360" w:lineRule="auto"/>
+        <w:ind w:left="418" w:leftChars="0" w:hanging="309" w:firstLineChars="0"/>
+        <w:jc w:val="both"/>
+        <w:textAlignment w:val="auto"/>
+        <w:rPr>
+          <w:rFonts w:hint="default" w:ascii="Times New Roman" w:hAnsi="Times New Roman" w:cs="Times New Roman"/>
+          <w:sz w:val="24"/>
+          <w:szCs w:val="24"/>
+        </w:rPr>
+      </w:pPr>
+      <w:r>
+        <w:rPr>
+          <w:rFonts w:hint="default" w:ascii="Times New Roman" w:hAnsi="Times New Roman" w:eastAsia="SimSun" w:cs="Times New Roman"/>
+          <w:kern w:val="0"/>
+          <w:sz w:val="24"/>
+          <w:szCs w:val="24"/>
+          <w:lang w:val="en-US" w:eastAsia="zh-CN" w:bidi="ar"/>
+        </w:rPr>
+        <w:t xml:space="preserve">Bước 1: Lựa chọn thuật toán giải Rubik (Kociemba Two-Phase hoặc </w:t>
+      </w:r>
+      <w:r>
+        <w:rPr>
+          <w:rFonts w:hint="default" w:ascii="Times New Roman" w:hAnsi="Times New Roman" w:eastAsia="SimSun" w:cs="Times New Roman"/>
+          <w:kern w:val="0"/>
+          <w:sz w:val="24"/>
+          <w:szCs w:val="24"/>
+          <w:lang w:val="vi-VN" w:eastAsia="zh-CN" w:bidi="ar"/>
+        </w:rPr>
+        <w:t>Cube X dot Net</w:t>
+      </w:r>
+      <w:r>
+        <w:rPr>
+          <w:rFonts w:hint="default" w:ascii="Times New Roman" w:hAnsi="Times New Roman" w:eastAsia="SimSun" w:cs="Times New Roman"/>
+          <w:kern w:val="0"/>
+          <w:sz w:val="24"/>
+          <w:szCs w:val="24"/>
+          <w:lang w:val="en-US" w:eastAsia="zh-CN" w:bidi="ar"/>
+        </w:rPr>
+        <w:t>).</w:t>
+      </w:r>
+    </w:p>
+    <w:p>
+      <w:pPr>
+        <w:keepNext w:val="0"/>
+        <w:keepLines w:val="0"/>
+        <w:pageBreakBefore w:val="0"/>
+        <w:widowControl/>
+        <w:numPr>
+          <w:ilvl w:val="0"/>
+          <w:numId w:val="12"/>
+        </w:numPr>
+        <w:suppressLineNumbers w:val="0"/>
+        <w:kinsoku/>
+        <w:wordWrap/>
+        <w:overflowPunct/>
+        <w:topLinePunct w:val="0"/>
+        <w:autoSpaceDE/>
+        <w:autoSpaceDN/>
+        <w:bidi w:val="0"/>
+        <w:adjustRightInd/>
+        <w:snapToGrid/>
+        <w:spacing w:line="360" w:lineRule="auto"/>
+        <w:ind w:left="418" w:leftChars="0" w:hanging="309" w:firstLineChars="0"/>
+        <w:jc w:val="both"/>
+        <w:textAlignment w:val="auto"/>
+        <w:rPr>
+          <w:rFonts w:hint="default" w:ascii="Times New Roman" w:hAnsi="Times New Roman" w:cs="Times New Roman"/>
+          <w:sz w:val="24"/>
+          <w:szCs w:val="24"/>
+        </w:rPr>
+      </w:pPr>
+      <w:r>
+        <w:rPr>
+          <w:rFonts w:hint="default" w:ascii="Times New Roman" w:hAnsi="Times New Roman" w:eastAsia="SimSun" w:cs="Times New Roman"/>
+          <w:kern w:val="0"/>
+          <w:sz w:val="24"/>
+          <w:szCs w:val="24"/>
+          <w:lang w:val="en-US" w:eastAsia="zh-CN" w:bidi="ar"/>
+        </w:rPr>
+        <w:t>Bước 2: Import thư viện Solver (C# DLL hoặc C# Script thuần) vào dự án Unity.</w:t>
+      </w:r>
+    </w:p>
+    <w:p>
+      <w:pPr>
+        <w:keepNext w:val="0"/>
+        <w:keepLines w:val="0"/>
+        <w:pageBreakBefore w:val="0"/>
+        <w:widowControl/>
+        <w:numPr>
+          <w:ilvl w:val="0"/>
+          <w:numId w:val="12"/>
+        </w:numPr>
+        <w:suppressLineNumbers w:val="0"/>
+        <w:kinsoku/>
+        <w:wordWrap/>
+        <w:overflowPunct/>
+        <w:topLinePunct w:val="0"/>
+        <w:autoSpaceDE/>
+        <w:autoSpaceDN/>
+        <w:bidi w:val="0"/>
+        <w:adjustRightInd/>
+        <w:snapToGrid/>
+        <w:spacing w:line="360" w:lineRule="auto"/>
+        <w:ind w:left="418" w:leftChars="0" w:hanging="309" w:firstLineChars="0"/>
+        <w:jc w:val="both"/>
+        <w:textAlignment w:val="auto"/>
+        <w:rPr>
+          <w:rFonts w:hint="default" w:ascii="Times New Roman" w:hAnsi="Times New Roman" w:cs="Times New Roman"/>
+          <w:sz w:val="24"/>
+          <w:szCs w:val="24"/>
+        </w:rPr>
+      </w:pPr>
+      <w:r>
+        <w:rPr>
+          <w:rFonts w:hint="default" w:ascii="Times New Roman" w:hAnsi="Times New Roman" w:eastAsia="SimSun" w:cs="Times New Roman"/>
+          <w:kern w:val="0"/>
+          <w:sz w:val="24"/>
+          <w:szCs w:val="24"/>
+          <w:lang w:val="en-US" w:eastAsia="zh-CN" w:bidi="ar"/>
+        </w:rPr>
+        <w:t>Bước 3: Viết hàm chuyển đổi trạng thái ma trận hiện tại của Rubik thành chuỗi ký hiệu đầu vào cho Solver.</w:t>
+      </w:r>
+    </w:p>
+    <w:p>
+      <w:pPr>
+        <w:keepNext w:val="0"/>
+        <w:keepLines w:val="0"/>
+        <w:pageBreakBefore w:val="0"/>
+        <w:widowControl/>
+        <w:numPr>
+          <w:ilvl w:val="0"/>
+          <w:numId w:val="12"/>
+        </w:numPr>
+        <w:suppressLineNumbers w:val="0"/>
+        <w:kinsoku/>
+        <w:wordWrap/>
+        <w:overflowPunct/>
+        <w:topLinePunct w:val="0"/>
+        <w:autoSpaceDE/>
+        <w:autoSpaceDN/>
+        <w:bidi w:val="0"/>
+        <w:adjustRightInd/>
+        <w:snapToGrid/>
+        <w:spacing w:line="360" w:lineRule="auto"/>
+        <w:ind w:left="418" w:leftChars="0" w:hanging="309" w:firstLineChars="0"/>
+        <w:jc w:val="both"/>
+        <w:textAlignment w:val="auto"/>
+        <w:rPr>
+          <w:rFonts w:hint="default" w:ascii="Times New Roman" w:hAnsi="Times New Roman" w:cs="Times New Roman"/>
+          <w:sz w:val="24"/>
+          <w:szCs w:val="24"/>
+        </w:rPr>
+      </w:pPr>
+      <w:r>
+        <w:rPr>
+          <w:rFonts w:hint="default" w:ascii="Times New Roman" w:hAnsi="Times New Roman" w:eastAsia="SimSun" w:cs="Times New Roman"/>
+          <w:kern w:val="0"/>
+          <w:sz w:val="24"/>
+          <w:szCs w:val="24"/>
+          <w:lang w:val="en-US" w:eastAsia="zh-CN" w:bidi="ar"/>
+        </w:rPr>
+        <w:t>Bước 4: Nhận chuỗi giải đáp (Solution String, ví dụ: R U R' U') từ Solver.</w:t>
+      </w:r>
+    </w:p>
+    <w:p>
+      <w:pPr>
+        <w:keepNext w:val="0"/>
+        <w:keepLines w:val="0"/>
+        <w:pageBreakBefore w:val="0"/>
+        <w:widowControl/>
+        <w:numPr>
+          <w:ilvl w:val="0"/>
+          <w:numId w:val="12"/>
+        </w:numPr>
+        <w:suppressLineNumbers w:val="0"/>
+        <w:kinsoku/>
+        <w:wordWrap/>
+        <w:overflowPunct/>
+        <w:topLinePunct w:val="0"/>
+        <w:autoSpaceDE/>
+        <w:autoSpaceDN/>
+        <w:bidi w:val="0"/>
+        <w:adjustRightInd/>
+        <w:snapToGrid/>
+        <w:spacing w:line="360" w:lineRule="auto"/>
+        <w:ind w:left="418" w:leftChars="0" w:hanging="309" w:firstLineChars="0"/>
+        <w:jc w:val="both"/>
+        <w:textAlignment w:val="auto"/>
+        <w:rPr>
+          <w:rFonts w:hint="default" w:ascii="Times New Roman" w:hAnsi="Times New Roman" w:cs="Times New Roman"/>
+          <w:sz w:val="24"/>
+          <w:szCs w:val="24"/>
+        </w:rPr>
+      </w:pPr>
+      <w:r>
+        <w:rPr>
+          <w:rFonts w:hint="default" w:ascii="Times New Roman" w:hAnsi="Times New Roman" w:eastAsia="SimSun" w:cs="Times New Roman"/>
+          <w:kern w:val="0"/>
+          <w:sz w:val="24"/>
+          <w:szCs w:val="24"/>
+          <w:lang w:val="en-US" w:eastAsia="zh-CN" w:bidi="ar"/>
+        </w:rPr>
+        <w:t>Bước 5: Xây dựng bộ Queue (Hàng đợi) để đọc chuỗi giải và tự động thực thi chuỗi động tác xoay 3D từng bước.</w:t>
+      </w:r>
+    </w:p>
+    <w:p>
+      <w:pPr>
+        <w:keepNext w:val="0"/>
+        <w:keepLines w:val="0"/>
+        <w:pageBreakBefore w:val="0"/>
+        <w:widowControl/>
+        <w:suppressLineNumbers w:val="0"/>
+        <w:kinsoku/>
+        <w:wordWrap/>
+        <w:overflowPunct/>
+        <w:topLinePunct w:val="0"/>
+        <w:autoSpaceDE/>
+        <w:autoSpaceDN/>
+        <w:bidi w:val="0"/>
+        <w:adjustRightInd/>
+        <w:snapToGrid/>
+        <w:spacing w:line="360" w:lineRule="auto"/>
+        <w:jc w:val="both"/>
+        <w:textAlignment w:val="auto"/>
+        <w:rPr>
+          <w:rFonts w:hint="default" w:ascii="Times New Roman" w:hAnsi="Times New Roman" w:cs="Times New Roman"/>
+          <w:b/>
+          <w:bCs/>
+          <w:sz w:val="24"/>
+          <w:szCs w:val="24"/>
+        </w:rPr>
+      </w:pPr>
+      <w:r>
+        <w:rPr>
+          <w:rFonts w:hint="default" w:ascii="Times New Roman" w:hAnsi="Times New Roman" w:eastAsia="SimSun" w:cs="Times New Roman"/>
+          <w:b/>
+          <w:bCs/>
+          <w:kern w:val="0"/>
+          <w:sz w:val="24"/>
+          <w:szCs w:val="24"/>
+          <w:lang w:val="en-US" w:eastAsia="zh-CN" w:bidi="ar"/>
+        </w:rPr>
+        <w:t>Kiểm thử trong Unity (Testing &amp; Refinement in Unity Editor)</w:t>
+      </w:r>
+    </w:p>
+    <w:p>
+      <w:pPr>
+        <w:keepNext w:val="0"/>
+        <w:keepLines w:val="0"/>
+        <w:pageBreakBefore w:val="0"/>
+        <w:widowControl/>
+        <w:numPr>
+          <w:ilvl w:val="0"/>
+          <w:numId w:val="12"/>
+        </w:numPr>
+        <w:suppressLineNumbers w:val="0"/>
+        <w:kinsoku/>
+        <w:wordWrap/>
+        <w:overflowPunct/>
+        <w:topLinePunct w:val="0"/>
+        <w:autoSpaceDE/>
+        <w:autoSpaceDN/>
+        <w:bidi w:val="0"/>
+        <w:adjustRightInd/>
+        <w:snapToGrid/>
+        <w:spacing w:line="360" w:lineRule="auto"/>
+        <w:ind w:left="418" w:leftChars="0" w:hanging="309" w:firstLineChars="0"/>
+        <w:jc w:val="both"/>
+        <w:textAlignment w:val="auto"/>
+        <w:rPr>
+          <w:rFonts w:hint="default" w:ascii="Times New Roman" w:hAnsi="Times New Roman" w:cs="Times New Roman"/>
+          <w:sz w:val="24"/>
+          <w:szCs w:val="24"/>
+        </w:rPr>
+      </w:pPr>
+      <w:r>
+        <w:rPr>
+          <w:rFonts w:hint="default" w:ascii="Times New Roman" w:hAnsi="Times New Roman" w:eastAsia="SimSun" w:cs="Times New Roman"/>
+          <w:kern w:val="0"/>
+          <w:sz w:val="24"/>
+          <w:szCs w:val="24"/>
+          <w:lang w:val="en-US" w:eastAsia="zh-CN" w:bidi="ar"/>
+        </w:rPr>
+        <w:t>Bước 1: Kiểm thử thao tác vuốt xoay xem có bị kẹt, nhảy sai góc hay chọn nhầm lớp khối không.</w:t>
+      </w:r>
+    </w:p>
+    <w:p>
+      <w:pPr>
+        <w:keepNext w:val="0"/>
+        <w:keepLines w:val="0"/>
+        <w:pageBreakBefore w:val="0"/>
+        <w:widowControl/>
+        <w:numPr>
+          <w:ilvl w:val="0"/>
+          <w:numId w:val="12"/>
+        </w:numPr>
+        <w:suppressLineNumbers w:val="0"/>
+        <w:kinsoku/>
+        <w:wordWrap/>
+        <w:overflowPunct/>
+        <w:topLinePunct w:val="0"/>
+        <w:autoSpaceDE/>
+        <w:autoSpaceDN/>
+        <w:bidi w:val="0"/>
+        <w:adjustRightInd/>
+        <w:snapToGrid/>
+        <w:spacing w:line="360" w:lineRule="auto"/>
+        <w:ind w:left="418" w:leftChars="0" w:hanging="309" w:firstLineChars="0"/>
+        <w:jc w:val="both"/>
+        <w:textAlignment w:val="auto"/>
+        <w:rPr>
+          <w:rFonts w:hint="default" w:ascii="Times New Roman" w:hAnsi="Times New Roman" w:cs="Times New Roman"/>
+          <w:sz w:val="24"/>
+          <w:szCs w:val="24"/>
+        </w:rPr>
+      </w:pPr>
+      <w:r>
+        <w:rPr>
+          <w:rFonts w:hint="default" w:ascii="Times New Roman" w:hAnsi="Times New Roman" w:eastAsia="SimSun" w:cs="Times New Roman"/>
+          <w:kern w:val="0"/>
+          <w:sz w:val="24"/>
+          <w:szCs w:val="24"/>
+          <w:lang w:val="en-US" w:eastAsia="zh-CN" w:bidi="ar"/>
+        </w:rPr>
+        <w:t>Bước 2: Kiểm thử tính chính xác của Solver với nhiều trạng thái xáo trộn khác nhau.</w:t>
+      </w:r>
+    </w:p>
+    <w:p>
+      <w:pPr>
+        <w:keepNext w:val="0"/>
+        <w:keepLines w:val="0"/>
+        <w:pageBreakBefore w:val="0"/>
+        <w:widowControl/>
+        <w:numPr>
+          <w:ilvl w:val="0"/>
+          <w:numId w:val="12"/>
+        </w:numPr>
+        <w:suppressLineNumbers w:val="0"/>
+        <w:kinsoku/>
+        <w:wordWrap/>
+        <w:overflowPunct/>
+        <w:topLinePunct w:val="0"/>
+        <w:autoSpaceDE/>
+        <w:autoSpaceDN/>
+        <w:bidi w:val="0"/>
+        <w:adjustRightInd/>
+        <w:snapToGrid/>
+        <w:spacing w:line="360" w:lineRule="auto"/>
+        <w:ind w:left="418" w:leftChars="0" w:hanging="309" w:firstLineChars="0"/>
+        <w:jc w:val="both"/>
+        <w:textAlignment w:val="auto"/>
+        <w:rPr>
+          <w:rFonts w:hint="default" w:ascii="Times New Roman" w:hAnsi="Times New Roman" w:cs="Times New Roman"/>
+          <w:sz w:val="24"/>
+          <w:szCs w:val="24"/>
+        </w:rPr>
+      </w:pPr>
+      <w:r>
+        <w:rPr>
+          <w:rFonts w:hint="default" w:ascii="Times New Roman" w:hAnsi="Times New Roman" w:eastAsia="SimSun" w:cs="Times New Roman"/>
+          <w:kern w:val="0"/>
+          <w:sz w:val="24"/>
+          <w:szCs w:val="24"/>
+          <w:lang w:val="en-US" w:eastAsia="zh-CN" w:bidi="ar"/>
+        </w:rPr>
+        <w:t>Bước 3: Bổ sung hiệu ứng âm thanh (AudioFX khi xoay), đổ bóng (Shadows) và ánh sáng (Lighting).</w:t>
+      </w:r>
+    </w:p>
+    <w:p>
+      <w:pPr>
+        <w:keepNext w:val="0"/>
+        <w:keepLines w:val="0"/>
+        <w:pageBreakBefore w:val="0"/>
+        <w:widowControl/>
+        <w:numPr>
+          <w:ilvl w:val="0"/>
+          <w:numId w:val="12"/>
+        </w:numPr>
+        <w:suppressLineNumbers w:val="0"/>
+        <w:kinsoku/>
+        <w:wordWrap/>
+        <w:overflowPunct/>
+        <w:topLinePunct w:val="0"/>
+        <w:autoSpaceDE/>
+        <w:autoSpaceDN/>
+        <w:bidi w:val="0"/>
+        <w:adjustRightInd/>
+        <w:snapToGrid/>
+        <w:spacing w:line="360" w:lineRule="auto"/>
+        <w:ind w:left="418" w:leftChars="0" w:hanging="309" w:firstLineChars="0"/>
+        <w:jc w:val="both"/>
+        <w:textAlignment w:val="auto"/>
+        <w:rPr>
+          <w:rFonts w:hint="default" w:ascii="Times New Roman" w:hAnsi="Times New Roman" w:cs="Times New Roman"/>
+          <w:sz w:val="24"/>
+          <w:szCs w:val="24"/>
+        </w:rPr>
+      </w:pPr>
+      <w:r>
+        <w:rPr>
+          <w:rFonts w:hint="default" w:ascii="Times New Roman" w:hAnsi="Times New Roman" w:eastAsia="SimSun" w:cs="Times New Roman"/>
+          <w:kern w:val="0"/>
+          <w:sz w:val="24"/>
+          <w:szCs w:val="24"/>
+          <w:lang w:val="en-US" w:eastAsia="zh-CN" w:bidi="ar"/>
+        </w:rPr>
+        <w:t>Bước 4: Tối ưu hóa Camera (Camera Controls - xoay toàn cảnh khối Rubik, Zoom in/out).</w:t>
+      </w:r>
+    </w:p>
+    <w:p>
+      <w:pPr>
+        <w:keepNext w:val="0"/>
+        <w:keepLines w:val="0"/>
+        <w:pageBreakBefore w:val="0"/>
+        <w:widowControl/>
+        <w:numPr>
+          <w:ilvl w:val="0"/>
+          <w:numId w:val="12"/>
+        </w:numPr>
+        <w:suppressLineNumbers w:val="0"/>
+        <w:kinsoku/>
+        <w:wordWrap/>
+        <w:overflowPunct/>
+        <w:topLinePunct w:val="0"/>
+        <w:autoSpaceDE/>
+        <w:autoSpaceDN/>
+        <w:bidi w:val="0"/>
+        <w:adjustRightInd/>
+        <w:snapToGrid/>
+        <w:spacing w:line="360" w:lineRule="auto"/>
+        <w:ind w:left="418" w:leftChars="0" w:hanging="309" w:firstLineChars="0"/>
+        <w:jc w:val="both"/>
+        <w:textAlignment w:val="auto"/>
+        <w:rPr>
+          <w:rFonts w:hint="default" w:ascii="Times New Roman" w:hAnsi="Times New Roman" w:cs="Times New Roman"/>
+          <w:sz w:val="24"/>
+          <w:szCs w:val="24"/>
+        </w:rPr>
+      </w:pPr>
+      <w:r>
+        <w:rPr>
+          <w:rFonts w:hint="default" w:ascii="Times New Roman" w:hAnsi="Times New Roman" w:eastAsia="SimSun" w:cs="Times New Roman"/>
+          <w:kern w:val="0"/>
+          <w:sz w:val="24"/>
+          <w:szCs w:val="24"/>
+          <w:lang w:val="en-US" w:eastAsia="zh-CN" w:bidi="ar"/>
+        </w:rPr>
+        <w:t>Bước 5: Kiểm tra hiệu năng (Frame Rate - FPS, Garbage Collection) ngay trên Unity Editor.</w:t>
+      </w:r>
+    </w:p>
+    <w:p>
+      <w:pPr>
+        <w:keepNext w:val="0"/>
+        <w:keepLines w:val="0"/>
+        <w:pageBreakBefore w:val="0"/>
+        <w:widowControl/>
+        <w:suppressLineNumbers w:val="0"/>
+        <w:kinsoku/>
+        <w:wordWrap/>
+        <w:overflowPunct/>
+        <w:topLinePunct w:val="0"/>
+        <w:autoSpaceDE/>
+        <w:autoSpaceDN/>
+        <w:bidi w:val="0"/>
+        <w:adjustRightInd/>
+        <w:snapToGrid/>
+        <w:spacing w:line="360" w:lineRule="auto"/>
+        <w:jc w:val="both"/>
+        <w:textAlignment w:val="auto"/>
+        <w:rPr>
+          <w:rFonts w:hint="default" w:ascii="Times New Roman" w:hAnsi="Times New Roman" w:cs="Times New Roman"/>
+          <w:b/>
+          <w:bCs/>
+          <w:sz w:val="24"/>
+          <w:szCs w:val="24"/>
+        </w:rPr>
+      </w:pPr>
+      <w:r>
+        <w:rPr>
+          <w:rFonts w:hint="default" w:ascii="Times New Roman" w:hAnsi="Times New Roman" w:eastAsia="SimSun" w:cs="Times New Roman"/>
+          <w:b/>
+          <w:bCs/>
+          <w:kern w:val="0"/>
+          <w:sz w:val="24"/>
+          <w:szCs w:val="24"/>
+          <w:lang w:val="en-US" w:eastAsia="zh-CN" w:bidi="ar"/>
+        </w:rPr>
+        <w:t> Chuẩn bị Android (Android Build Settings)</w:t>
+      </w:r>
+    </w:p>
+    <w:p>
+      <w:pPr>
+        <w:keepNext w:val="0"/>
+        <w:keepLines w:val="0"/>
+        <w:pageBreakBefore w:val="0"/>
+        <w:widowControl/>
+        <w:numPr>
+          <w:ilvl w:val="0"/>
+          <w:numId w:val="12"/>
+        </w:numPr>
+        <w:suppressLineNumbers w:val="0"/>
+        <w:kinsoku/>
+        <w:wordWrap/>
+        <w:overflowPunct/>
+        <w:topLinePunct w:val="0"/>
+        <w:autoSpaceDE/>
+        <w:autoSpaceDN/>
+        <w:bidi w:val="0"/>
+        <w:adjustRightInd/>
+        <w:snapToGrid/>
+        <w:spacing w:line="360" w:lineRule="auto"/>
+        <w:ind w:left="418" w:leftChars="0" w:hanging="309" w:firstLineChars="0"/>
+        <w:jc w:val="both"/>
+        <w:textAlignment w:val="auto"/>
+        <w:rPr>
+          <w:rFonts w:hint="default" w:ascii="Times New Roman" w:hAnsi="Times New Roman" w:cs="Times New Roman"/>
+          <w:sz w:val="24"/>
+          <w:szCs w:val="24"/>
+        </w:rPr>
+      </w:pPr>
+      <w:r>
+        <w:rPr>
+          <w:rFonts w:hint="default" w:ascii="Times New Roman" w:hAnsi="Times New Roman" w:eastAsia="SimSun" w:cs="Times New Roman"/>
+          <w:kern w:val="0"/>
+          <w:sz w:val="24"/>
+          <w:szCs w:val="24"/>
+          <w:lang w:val="en-US" w:eastAsia="zh-CN" w:bidi="ar"/>
+        </w:rPr>
+        <w:t xml:space="preserve">Bước 1: Chuyển Platform trong Unity sang Android </w:t>
+      </w:r>
+    </w:p>
+    <w:p>
+      <w:pPr>
+        <w:keepNext w:val="0"/>
+        <w:keepLines w:val="0"/>
+        <w:pageBreakBefore w:val="0"/>
+        <w:widowControl/>
+        <w:numPr>
+          <w:ilvl w:val="0"/>
+          <w:numId w:val="12"/>
+        </w:numPr>
+        <w:suppressLineNumbers w:val="0"/>
+        <w:kinsoku/>
+        <w:wordWrap/>
+        <w:overflowPunct/>
+        <w:topLinePunct w:val="0"/>
+        <w:autoSpaceDE/>
+        <w:autoSpaceDN/>
+        <w:bidi w:val="0"/>
+        <w:adjustRightInd/>
+        <w:snapToGrid/>
+        <w:spacing w:line="360" w:lineRule="auto"/>
+        <w:ind w:left="418" w:leftChars="0" w:hanging="309" w:firstLineChars="0"/>
+        <w:jc w:val="both"/>
+        <w:textAlignment w:val="auto"/>
+        <w:rPr>
+          <w:rFonts w:hint="default" w:ascii="Times New Roman" w:hAnsi="Times New Roman" w:cs="Times New Roman"/>
+          <w:sz w:val="24"/>
+          <w:szCs w:val="24"/>
+        </w:rPr>
+      </w:pPr>
+      <w:r>
+        <w:rPr>
+          <w:rFonts w:hint="default" w:ascii="Times New Roman" w:hAnsi="Times New Roman" w:eastAsia="SimSun" w:cs="Times New Roman"/>
+          <w:kern w:val="0"/>
+          <w:sz w:val="24"/>
+          <w:szCs w:val="24"/>
+          <w:lang w:val="en-US" w:eastAsia="zh-CN" w:bidi="ar"/>
+        </w:rPr>
+        <w:t>Bước 2: Tải và cấu hình đúng phiên bản Android NDK, SDK và JDK trong Unity Preferences.</w:t>
+      </w:r>
+    </w:p>
+    <w:p>
+      <w:pPr>
+        <w:keepNext w:val="0"/>
+        <w:keepLines w:val="0"/>
+        <w:pageBreakBefore w:val="0"/>
+        <w:widowControl/>
+        <w:numPr>
+          <w:ilvl w:val="0"/>
+          <w:numId w:val="12"/>
+        </w:numPr>
+        <w:suppressLineNumbers w:val="0"/>
+        <w:kinsoku/>
+        <w:wordWrap/>
+        <w:overflowPunct/>
+        <w:topLinePunct w:val="0"/>
+        <w:autoSpaceDE/>
+        <w:autoSpaceDN/>
+        <w:bidi w:val="0"/>
+        <w:adjustRightInd/>
+        <w:snapToGrid/>
+        <w:spacing w:line="360" w:lineRule="auto"/>
+        <w:ind w:left="418" w:leftChars="0" w:hanging="309" w:firstLineChars="0"/>
+        <w:jc w:val="both"/>
+        <w:textAlignment w:val="auto"/>
+        <w:rPr>
+          <w:rFonts w:hint="default" w:ascii="Times New Roman" w:hAnsi="Times New Roman" w:cs="Times New Roman"/>
+          <w:sz w:val="24"/>
+          <w:szCs w:val="24"/>
+        </w:rPr>
+      </w:pPr>
+      <w:r>
+        <w:rPr>
+          <w:rFonts w:hint="default" w:ascii="Times New Roman" w:hAnsi="Times New Roman" w:eastAsia="SimSun" w:cs="Times New Roman"/>
+          <w:kern w:val="0"/>
+          <w:sz w:val="24"/>
+          <w:szCs w:val="24"/>
+          <w:lang w:val="en-US" w:eastAsia="zh-CN" w:bidi="ar"/>
+        </w:rPr>
+        <w:t xml:space="preserve">Bước 3: Cấu hình Player Settings: Đặt Package Name, Target API Level </w:t>
+      </w:r>
+    </w:p>
+    <w:p>
+      <w:pPr>
+        <w:keepNext w:val="0"/>
+        <w:keepLines w:val="0"/>
+        <w:pageBreakBefore w:val="0"/>
+        <w:widowControl/>
+        <w:numPr>
+          <w:ilvl w:val="0"/>
+          <w:numId w:val="12"/>
+        </w:numPr>
+        <w:suppressLineNumbers w:val="0"/>
+        <w:kinsoku/>
+        <w:wordWrap/>
+        <w:overflowPunct/>
+        <w:topLinePunct w:val="0"/>
+        <w:autoSpaceDE/>
+        <w:autoSpaceDN/>
+        <w:bidi w:val="0"/>
+        <w:adjustRightInd/>
+        <w:snapToGrid/>
+        <w:spacing w:line="360" w:lineRule="auto"/>
+        <w:ind w:left="418" w:leftChars="0" w:hanging="309" w:firstLineChars="0"/>
+        <w:jc w:val="both"/>
+        <w:textAlignment w:val="auto"/>
+        <w:rPr>
+          <w:rFonts w:hint="default" w:ascii="Times New Roman" w:hAnsi="Times New Roman" w:cs="Times New Roman"/>
+          <w:sz w:val="24"/>
+          <w:szCs w:val="24"/>
+        </w:rPr>
+      </w:pPr>
+      <w:r>
+        <w:rPr>
+          <w:rFonts w:hint="default" w:ascii="Times New Roman" w:hAnsi="Times New Roman" w:eastAsia="SimSun" w:cs="Times New Roman"/>
+          <w:kern w:val="0"/>
+          <w:sz w:val="24"/>
+          <w:szCs w:val="24"/>
+          <w:lang w:val="en-US" w:eastAsia="zh-CN" w:bidi="ar"/>
+        </w:rPr>
+        <w:t>Bước 4: Thiết lập Scripting Backend thành IL2CPP và bật hỗ trợ kiến trúc ARM64.</w:t>
+      </w:r>
+    </w:p>
+    <w:p>
+      <w:pPr>
+        <w:keepNext w:val="0"/>
+        <w:keepLines w:val="0"/>
+        <w:pageBreakBefore w:val="0"/>
+        <w:widowControl/>
+        <w:numPr>
+          <w:ilvl w:val="0"/>
+          <w:numId w:val="12"/>
+        </w:numPr>
+        <w:suppressLineNumbers w:val="0"/>
+        <w:kinsoku/>
+        <w:wordWrap/>
+        <w:overflowPunct/>
+        <w:topLinePunct w:val="0"/>
+        <w:autoSpaceDE/>
+        <w:autoSpaceDN/>
+        <w:bidi w:val="0"/>
+        <w:adjustRightInd/>
+        <w:snapToGrid/>
+        <w:spacing w:line="360" w:lineRule="auto"/>
+        <w:ind w:left="418" w:leftChars="0" w:hanging="309" w:firstLineChars="0"/>
+        <w:jc w:val="both"/>
+        <w:textAlignment w:val="auto"/>
+        <w:rPr>
+          <w:rFonts w:hint="default" w:ascii="Times New Roman" w:hAnsi="Times New Roman" w:cs="Times New Roman"/>
+          <w:sz w:val="24"/>
+          <w:szCs w:val="24"/>
+        </w:rPr>
+      </w:pPr>
+      <w:r>
+        <w:rPr>
+          <w:rFonts w:hint="default" w:ascii="Times New Roman" w:hAnsi="Times New Roman" w:eastAsia="SimSun" w:cs="Times New Roman"/>
+          <w:kern w:val="0"/>
+          <w:sz w:val="24"/>
+          <w:szCs w:val="24"/>
+          <w:lang w:val="en-US" w:eastAsia="zh-CN" w:bidi="ar"/>
+        </w:rPr>
+        <w:t>Bước 5: Bật tùy chọn Export Project trong cửa sổ Build Settings.</w:t>
+      </w:r>
+    </w:p>
+    <w:p>
+      <w:pPr>
+        <w:keepNext w:val="0"/>
+        <w:keepLines w:val="0"/>
+        <w:pageBreakBefore w:val="0"/>
+        <w:widowControl/>
+        <w:suppressLineNumbers w:val="0"/>
+        <w:kinsoku/>
+        <w:wordWrap/>
+        <w:overflowPunct/>
+        <w:topLinePunct w:val="0"/>
+        <w:autoSpaceDE/>
+        <w:autoSpaceDN/>
+        <w:bidi w:val="0"/>
+        <w:adjustRightInd/>
+        <w:snapToGrid/>
+        <w:spacing w:line="360" w:lineRule="auto"/>
+        <w:jc w:val="both"/>
+        <w:textAlignment w:val="auto"/>
+        <w:rPr>
+          <w:rFonts w:hint="default" w:ascii="Times New Roman" w:hAnsi="Times New Roman" w:cs="Times New Roman"/>
+          <w:b/>
+          <w:bCs/>
+          <w:sz w:val="24"/>
+          <w:szCs w:val="24"/>
+        </w:rPr>
+      </w:pPr>
+      <w:r>
+        <w:rPr>
+          <w:rFonts w:hint="default" w:ascii="Times New Roman" w:hAnsi="Times New Roman" w:eastAsia="SimSun" w:cs="Times New Roman"/>
+          <w:b/>
+          <w:bCs/>
+          <w:kern w:val="0"/>
+          <w:sz w:val="24"/>
+          <w:szCs w:val="24"/>
+          <w:lang w:val="en-US" w:eastAsia="zh-CN" w:bidi="ar"/>
+        </w:rPr>
+        <w:t>Export Unity (Export Unity Project as Library)</w:t>
+      </w:r>
+    </w:p>
+    <w:p>
+      <w:pPr>
+        <w:keepNext w:val="0"/>
+        <w:keepLines w:val="0"/>
+        <w:pageBreakBefore w:val="0"/>
+        <w:widowControl/>
+        <w:numPr>
+          <w:ilvl w:val="0"/>
+          <w:numId w:val="12"/>
+        </w:numPr>
+        <w:suppressLineNumbers w:val="0"/>
+        <w:kinsoku/>
+        <w:wordWrap/>
+        <w:overflowPunct/>
+        <w:topLinePunct w:val="0"/>
+        <w:autoSpaceDE/>
+        <w:autoSpaceDN/>
+        <w:bidi w:val="0"/>
+        <w:adjustRightInd/>
+        <w:snapToGrid/>
+        <w:spacing w:line="360" w:lineRule="auto"/>
+        <w:ind w:left="418" w:leftChars="0" w:hanging="309" w:firstLineChars="0"/>
+        <w:jc w:val="both"/>
+        <w:textAlignment w:val="auto"/>
+        <w:rPr>
+          <w:rFonts w:hint="default" w:ascii="Times New Roman" w:hAnsi="Times New Roman" w:cs="Times New Roman"/>
+          <w:sz w:val="24"/>
+          <w:szCs w:val="24"/>
+        </w:rPr>
+      </w:pPr>
+      <w:r>
+        <w:rPr>
+          <w:rFonts w:hint="default" w:ascii="Times New Roman" w:hAnsi="Times New Roman" w:eastAsia="SimSun" w:cs="Times New Roman"/>
+          <w:kern w:val="0"/>
+          <w:sz w:val="24"/>
+          <w:szCs w:val="24"/>
+          <w:lang w:val="en-US" w:eastAsia="zh-CN" w:bidi="ar"/>
+        </w:rPr>
+        <w:t>Bước 1: Tạo một thư mục chứa output export riêng biệt.</w:t>
+      </w:r>
+    </w:p>
+    <w:p>
+      <w:pPr>
+        <w:keepNext w:val="0"/>
+        <w:keepLines w:val="0"/>
+        <w:pageBreakBefore w:val="0"/>
+        <w:widowControl/>
+        <w:numPr>
+          <w:ilvl w:val="0"/>
+          <w:numId w:val="12"/>
+        </w:numPr>
+        <w:suppressLineNumbers w:val="0"/>
+        <w:kinsoku/>
+        <w:wordWrap/>
+        <w:overflowPunct/>
+        <w:topLinePunct w:val="0"/>
+        <w:autoSpaceDE/>
+        <w:autoSpaceDN/>
+        <w:bidi w:val="0"/>
+        <w:adjustRightInd/>
+        <w:snapToGrid/>
+        <w:spacing w:line="360" w:lineRule="auto"/>
+        <w:ind w:left="418" w:leftChars="0" w:hanging="309" w:firstLineChars="0"/>
+        <w:jc w:val="both"/>
+        <w:textAlignment w:val="auto"/>
+        <w:rPr>
+          <w:rFonts w:hint="default" w:ascii="Times New Roman" w:hAnsi="Times New Roman" w:cs="Times New Roman"/>
+          <w:sz w:val="24"/>
+          <w:szCs w:val="24"/>
+        </w:rPr>
+      </w:pPr>
+      <w:r>
+        <w:rPr>
+          <w:rFonts w:hint="default" w:ascii="Times New Roman" w:hAnsi="Times New Roman" w:eastAsia="SimSun" w:cs="Times New Roman"/>
+          <w:kern w:val="0"/>
+          <w:sz w:val="24"/>
+          <w:szCs w:val="24"/>
+          <w:lang w:val="en-US" w:eastAsia="zh-CN" w:bidi="ar"/>
+        </w:rPr>
+        <w:t>Bước 2: Nhấn nút Export trong Unity Build Settings để xuất ra thư mục unityLibrary Android Gradle Project.</w:t>
+      </w:r>
+    </w:p>
+    <w:p>
+      <w:pPr>
+        <w:keepNext w:val="0"/>
+        <w:keepLines w:val="0"/>
+        <w:pageBreakBefore w:val="0"/>
+        <w:widowControl/>
+        <w:numPr>
+          <w:ilvl w:val="0"/>
+          <w:numId w:val="12"/>
+        </w:numPr>
+        <w:suppressLineNumbers w:val="0"/>
+        <w:kinsoku/>
+        <w:wordWrap/>
+        <w:overflowPunct/>
+        <w:topLinePunct w:val="0"/>
+        <w:autoSpaceDE/>
+        <w:autoSpaceDN/>
+        <w:bidi w:val="0"/>
+        <w:adjustRightInd/>
+        <w:snapToGrid/>
+        <w:spacing w:line="360" w:lineRule="auto"/>
+        <w:ind w:left="418" w:leftChars="0" w:hanging="309" w:firstLineChars="0"/>
+        <w:jc w:val="both"/>
+        <w:textAlignment w:val="auto"/>
+        <w:rPr>
+          <w:rFonts w:hint="default" w:ascii="Times New Roman" w:hAnsi="Times New Roman" w:cs="Times New Roman"/>
+          <w:sz w:val="24"/>
+          <w:szCs w:val="24"/>
+        </w:rPr>
+      </w:pPr>
+      <w:r>
+        <w:rPr>
+          <w:rFonts w:hint="default" w:ascii="Times New Roman" w:hAnsi="Times New Roman" w:eastAsia="SimSun" w:cs="Times New Roman"/>
+          <w:kern w:val="0"/>
+          <w:sz w:val="24"/>
+          <w:szCs w:val="24"/>
+          <w:lang w:val="en-US" w:eastAsia="zh-CN" w:bidi="ar"/>
+        </w:rPr>
+        <w:t>Bước 3: Kiểm tra các file Gradle (build.gradle, settings.gradle) được sinh ra trong thư mục unityLibrary.</w:t>
+      </w:r>
+    </w:p>
+    <w:p>
+      <w:pPr>
+        <w:keepNext w:val="0"/>
+        <w:keepLines w:val="0"/>
+        <w:pageBreakBefore w:val="0"/>
+        <w:widowControl/>
+        <w:numPr>
+          <w:ilvl w:val="0"/>
+          <w:numId w:val="12"/>
+        </w:numPr>
+        <w:suppressLineNumbers w:val="0"/>
+        <w:kinsoku/>
+        <w:wordWrap/>
+        <w:overflowPunct/>
+        <w:topLinePunct w:val="0"/>
+        <w:autoSpaceDE/>
+        <w:autoSpaceDN/>
+        <w:bidi w:val="0"/>
+        <w:adjustRightInd/>
+        <w:snapToGrid/>
+        <w:spacing w:line="360" w:lineRule="auto"/>
+        <w:ind w:left="418" w:leftChars="0" w:hanging="309" w:firstLineChars="0"/>
+        <w:jc w:val="both"/>
+        <w:textAlignment w:val="auto"/>
+        <w:rPr>
+          <w:rFonts w:hint="default" w:ascii="Times New Roman" w:hAnsi="Times New Roman" w:cs="Times New Roman"/>
+          <w:sz w:val="24"/>
+          <w:szCs w:val="24"/>
+        </w:rPr>
+      </w:pPr>
+      <w:r>
+        <w:rPr>
+          <w:rFonts w:hint="default" w:ascii="Times New Roman" w:hAnsi="Times New Roman" w:eastAsia="SimSun" w:cs="Times New Roman"/>
+          <w:kern w:val="0"/>
+          <w:sz w:val="24"/>
+          <w:szCs w:val="24"/>
+          <w:lang w:val="en-US" w:eastAsia="zh-CN" w:bidi="ar"/>
+        </w:rPr>
+        <w:t>Bước 4: Chỉnh sửa file build.gradle của unityLibrary nếu có xung đột phiên bản NDK/Gradle với Flutter.</w:t>
+      </w:r>
+    </w:p>
+    <w:p>
+      <w:pPr>
+        <w:keepNext w:val="0"/>
+        <w:keepLines w:val="0"/>
+        <w:pageBreakBefore w:val="0"/>
+        <w:widowControl/>
+        <w:suppressLineNumbers w:val="0"/>
+        <w:kinsoku/>
+        <w:wordWrap/>
+        <w:overflowPunct/>
+        <w:topLinePunct w:val="0"/>
+        <w:autoSpaceDE/>
+        <w:autoSpaceDN/>
+        <w:bidi w:val="0"/>
+        <w:adjustRightInd/>
+        <w:snapToGrid/>
+        <w:spacing w:line="360" w:lineRule="auto"/>
+        <w:jc w:val="both"/>
+        <w:textAlignment w:val="auto"/>
+        <w:rPr>
+          <w:rFonts w:hint="default" w:ascii="Times New Roman" w:hAnsi="Times New Roman" w:cs="Times New Roman"/>
+          <w:b/>
+          <w:bCs/>
+          <w:sz w:val="24"/>
+          <w:szCs w:val="24"/>
+        </w:rPr>
+      </w:pPr>
+      <w:r>
+        <w:rPr>
+          <w:rFonts w:hint="default" w:ascii="Times New Roman" w:hAnsi="Times New Roman" w:eastAsia="SimSun" w:cs="Times New Roman"/>
+          <w:b/>
+          <w:bCs/>
+          <w:kern w:val="0"/>
+          <w:sz w:val="24"/>
+          <w:szCs w:val="24"/>
+          <w:lang w:val="en-US" w:eastAsia="zh-CN" w:bidi="ar"/>
+        </w:rPr>
+        <w:t>Tạo Flutter (Flutter Project Setup)</w:t>
+      </w:r>
+    </w:p>
+    <w:p>
+      <w:pPr>
+        <w:keepNext w:val="0"/>
+        <w:keepLines w:val="0"/>
+        <w:pageBreakBefore w:val="0"/>
+        <w:widowControl/>
+        <w:numPr>
+          <w:ilvl w:val="0"/>
+          <w:numId w:val="12"/>
+        </w:numPr>
+        <w:suppressLineNumbers w:val="0"/>
+        <w:kinsoku/>
+        <w:wordWrap/>
+        <w:overflowPunct/>
+        <w:topLinePunct w:val="0"/>
+        <w:autoSpaceDE/>
+        <w:autoSpaceDN/>
+        <w:bidi w:val="0"/>
+        <w:adjustRightInd/>
+        <w:snapToGrid/>
+        <w:spacing w:line="360" w:lineRule="auto"/>
+        <w:ind w:left="418" w:leftChars="0" w:hanging="309" w:firstLineChars="0"/>
+        <w:jc w:val="both"/>
+        <w:textAlignment w:val="auto"/>
+        <w:rPr>
+          <w:rFonts w:hint="default" w:ascii="Times New Roman" w:hAnsi="Times New Roman" w:cs="Times New Roman"/>
+          <w:sz w:val="24"/>
+          <w:szCs w:val="24"/>
+        </w:rPr>
+      </w:pPr>
+      <w:r>
+        <w:rPr>
+          <w:rFonts w:hint="default" w:ascii="Times New Roman" w:hAnsi="Times New Roman" w:eastAsia="SimSun" w:cs="Times New Roman"/>
+          <w:kern w:val="0"/>
+          <w:sz w:val="24"/>
+          <w:szCs w:val="24"/>
+          <w:lang w:val="en-US" w:eastAsia="zh-CN" w:bidi="ar"/>
+        </w:rPr>
+        <w:t>Bước 1: Khởi tạo dự án Flutter mới bằng lệnh flutter create rubik_game.</w:t>
+      </w:r>
+    </w:p>
+    <w:p>
+      <w:pPr>
+        <w:keepNext w:val="0"/>
+        <w:keepLines w:val="0"/>
+        <w:pageBreakBefore w:val="0"/>
+        <w:widowControl/>
+        <w:numPr>
+          <w:ilvl w:val="0"/>
+          <w:numId w:val="12"/>
+        </w:numPr>
+        <w:suppressLineNumbers w:val="0"/>
+        <w:kinsoku/>
+        <w:wordWrap/>
+        <w:overflowPunct/>
+        <w:topLinePunct w:val="0"/>
+        <w:autoSpaceDE/>
+        <w:autoSpaceDN/>
+        <w:bidi w:val="0"/>
+        <w:adjustRightInd/>
+        <w:snapToGrid/>
+        <w:spacing w:line="360" w:lineRule="auto"/>
+        <w:ind w:left="418" w:leftChars="0" w:hanging="309" w:firstLineChars="0"/>
+        <w:jc w:val="both"/>
+        <w:textAlignment w:val="auto"/>
+        <w:rPr>
+          <w:rFonts w:hint="default" w:ascii="Times New Roman" w:hAnsi="Times New Roman" w:cs="Times New Roman"/>
+          <w:sz w:val="24"/>
+          <w:szCs w:val="24"/>
+        </w:rPr>
+      </w:pPr>
+      <w:r>
+        <w:rPr>
+          <w:rFonts w:hint="default" w:ascii="Times New Roman" w:hAnsi="Times New Roman" w:eastAsia="SimSun" w:cs="Times New Roman"/>
+          <w:kern w:val="0"/>
+          <w:sz w:val="24"/>
+          <w:szCs w:val="24"/>
+          <w:lang w:val="en-US" w:eastAsia="zh-CN" w:bidi="ar"/>
+        </w:rPr>
+        <w:t>Bước 2: Khai báo package kết nối flutter_unity_widget_2 trong file pubspec.yaml.</w:t>
+      </w:r>
+    </w:p>
+    <w:p>
+      <w:pPr>
+        <w:keepNext w:val="0"/>
+        <w:keepLines w:val="0"/>
+        <w:pageBreakBefore w:val="0"/>
+        <w:widowControl/>
+        <w:numPr>
+          <w:ilvl w:val="0"/>
+          <w:numId w:val="12"/>
+        </w:numPr>
+        <w:suppressLineNumbers w:val="0"/>
+        <w:kinsoku/>
+        <w:wordWrap/>
+        <w:overflowPunct/>
+        <w:topLinePunct w:val="0"/>
+        <w:autoSpaceDE/>
+        <w:autoSpaceDN/>
+        <w:bidi w:val="0"/>
+        <w:adjustRightInd/>
+        <w:snapToGrid/>
+        <w:spacing w:line="360" w:lineRule="auto"/>
+        <w:ind w:left="418" w:leftChars="0" w:hanging="309" w:firstLineChars="0"/>
+        <w:jc w:val="both"/>
+        <w:textAlignment w:val="auto"/>
+        <w:rPr>
+          <w:rFonts w:hint="default" w:ascii="Times New Roman" w:hAnsi="Times New Roman" w:cs="Times New Roman"/>
+          <w:sz w:val="24"/>
+          <w:szCs w:val="24"/>
+        </w:rPr>
+      </w:pPr>
+      <w:r>
+        <w:rPr>
+          <w:rFonts w:hint="default" w:ascii="Times New Roman" w:hAnsi="Times New Roman" w:eastAsia="SimSun" w:cs="Times New Roman"/>
+          <w:kern w:val="0"/>
+          <w:sz w:val="24"/>
+          <w:szCs w:val="24"/>
+          <w:lang w:val="en-US" w:eastAsia="zh-CN" w:bidi="ar"/>
+        </w:rPr>
+        <w:t>Bước 3: Khai báo package lưu trữ shared_preferences trong pubspec.yaml.</w:t>
+      </w:r>
+    </w:p>
+    <w:p>
+      <w:pPr>
+        <w:keepNext w:val="0"/>
+        <w:keepLines w:val="0"/>
+        <w:pageBreakBefore w:val="0"/>
+        <w:widowControl/>
+        <w:numPr>
+          <w:ilvl w:val="0"/>
+          <w:numId w:val="12"/>
+        </w:numPr>
+        <w:suppressLineNumbers w:val="0"/>
+        <w:kinsoku/>
+        <w:wordWrap/>
+        <w:overflowPunct/>
+        <w:topLinePunct w:val="0"/>
+        <w:autoSpaceDE/>
+        <w:autoSpaceDN/>
+        <w:bidi w:val="0"/>
+        <w:adjustRightInd/>
+        <w:snapToGrid/>
+        <w:spacing w:line="360" w:lineRule="auto"/>
+        <w:ind w:left="418" w:leftChars="0" w:hanging="309" w:firstLineChars="0"/>
+        <w:jc w:val="both"/>
+        <w:textAlignment w:val="auto"/>
+        <w:rPr>
+          <w:rFonts w:hint="default" w:ascii="Times New Roman" w:hAnsi="Times New Roman" w:cs="Times New Roman"/>
+          <w:sz w:val="24"/>
+          <w:szCs w:val="24"/>
+        </w:rPr>
+      </w:pPr>
+      <w:r>
+        <w:rPr>
+          <w:rFonts w:hint="default" w:ascii="Times New Roman" w:hAnsi="Times New Roman" w:eastAsia="SimSun" w:cs="Times New Roman"/>
+          <w:kern w:val="0"/>
+          <w:sz w:val="24"/>
+          <w:szCs w:val="24"/>
+          <w:lang w:val="en-US" w:eastAsia="zh-CN" w:bidi="ar"/>
+        </w:rPr>
+        <w:t>Bước 4: Chạy lệnh flutter pub get để tải các thư viện về dự án.</w:t>
+      </w:r>
+    </w:p>
+    <w:p>
+      <w:pPr>
+        <w:keepNext w:val="0"/>
+        <w:keepLines w:val="0"/>
+        <w:pageBreakBefore w:val="0"/>
+        <w:widowControl/>
+        <w:numPr>
+          <w:ilvl w:val="0"/>
+          <w:numId w:val="12"/>
+        </w:numPr>
+        <w:suppressLineNumbers w:val="0"/>
+        <w:kinsoku/>
+        <w:wordWrap/>
+        <w:overflowPunct/>
+        <w:topLinePunct w:val="0"/>
+        <w:autoSpaceDE/>
+        <w:autoSpaceDN/>
+        <w:bidi w:val="0"/>
+        <w:adjustRightInd/>
+        <w:snapToGrid/>
+        <w:spacing w:line="360" w:lineRule="auto"/>
+        <w:ind w:left="418" w:leftChars="0" w:hanging="309" w:firstLineChars="0"/>
+        <w:jc w:val="both"/>
+        <w:textAlignment w:val="auto"/>
+        <w:rPr>
+          <w:rFonts w:hint="default" w:ascii="Times New Roman" w:hAnsi="Times New Roman" w:cs="Times New Roman"/>
+          <w:sz w:val="24"/>
+          <w:szCs w:val="24"/>
+        </w:rPr>
+      </w:pPr>
+      <w:r>
+        <w:rPr>
+          <w:rFonts w:hint="default" w:ascii="Times New Roman" w:hAnsi="Times New Roman" w:eastAsia="SimSun" w:cs="Times New Roman"/>
+          <w:kern w:val="0"/>
+          <w:sz w:val="24"/>
+          <w:szCs w:val="24"/>
+          <w:lang w:val="en-US" w:eastAsia="zh-CN" w:bidi="ar"/>
+        </w:rPr>
+        <w:t>Bước 5: Cấu hình file android/settings.gradle và android/build.gradle của Flutter để liên kết thư mục unityLibrary</w:t>
+      </w:r>
+    </w:p>
+    <w:p>
+      <w:pPr>
+        <w:keepNext w:val="0"/>
+        <w:keepLines w:val="0"/>
+        <w:pageBreakBefore w:val="0"/>
+        <w:widowControl/>
+        <w:suppressLineNumbers w:val="0"/>
+        <w:kinsoku/>
+        <w:wordWrap/>
+        <w:overflowPunct/>
+        <w:topLinePunct w:val="0"/>
+        <w:autoSpaceDE/>
+        <w:autoSpaceDN/>
+        <w:bidi w:val="0"/>
+        <w:adjustRightInd/>
+        <w:snapToGrid/>
+        <w:spacing w:line="360" w:lineRule="auto"/>
+        <w:jc w:val="both"/>
+        <w:textAlignment w:val="auto"/>
+        <w:rPr>
+          <w:rFonts w:hint="default" w:ascii="Times New Roman" w:hAnsi="Times New Roman" w:cs="Times New Roman"/>
+          <w:b/>
+          <w:bCs/>
+          <w:sz w:val="24"/>
+          <w:szCs w:val="24"/>
+        </w:rPr>
+      </w:pPr>
+      <w:r>
+        <w:rPr>
+          <w:rFonts w:hint="default" w:ascii="Times New Roman" w:hAnsi="Times New Roman" w:eastAsia="SimSun" w:cs="Times New Roman"/>
+          <w:b/>
+          <w:bCs/>
+          <w:kern w:val="0"/>
+          <w:sz w:val="24"/>
+          <w:szCs w:val="24"/>
+          <w:lang w:val="en-US" w:eastAsia="zh-CN" w:bidi="ar"/>
+        </w:rPr>
+        <w:t>Tích hợp Unity vào Flutter (Embedding Unity Control)</w:t>
+      </w:r>
+    </w:p>
+    <w:p>
+      <w:pPr>
+        <w:keepNext w:val="0"/>
+        <w:keepLines w:val="0"/>
+        <w:pageBreakBefore w:val="0"/>
+        <w:widowControl/>
+        <w:numPr>
+          <w:ilvl w:val="0"/>
+          <w:numId w:val="12"/>
+        </w:numPr>
+        <w:suppressLineNumbers w:val="0"/>
+        <w:kinsoku/>
+        <w:wordWrap/>
+        <w:overflowPunct/>
+        <w:topLinePunct w:val="0"/>
+        <w:autoSpaceDE/>
+        <w:autoSpaceDN/>
+        <w:bidi w:val="0"/>
+        <w:adjustRightInd/>
+        <w:snapToGrid/>
+        <w:spacing w:line="360" w:lineRule="auto"/>
+        <w:ind w:left="418" w:leftChars="0" w:hanging="309" w:firstLineChars="0"/>
+        <w:jc w:val="both"/>
+        <w:textAlignment w:val="auto"/>
+        <w:rPr>
+          <w:rFonts w:hint="default" w:ascii="Times New Roman" w:hAnsi="Times New Roman" w:cs="Times New Roman"/>
+          <w:sz w:val="24"/>
+          <w:szCs w:val="24"/>
+        </w:rPr>
+      </w:pPr>
+      <w:r>
+        <w:rPr>
+          <w:rFonts w:hint="default" w:ascii="Times New Roman" w:hAnsi="Times New Roman" w:eastAsia="SimSun" w:cs="Times New Roman"/>
+          <w:kern w:val="0"/>
+          <w:sz w:val="24"/>
+          <w:szCs w:val="24"/>
+          <w:lang w:val="en-US" w:eastAsia="zh-CN" w:bidi="ar"/>
+        </w:rPr>
+        <w:t>Bước 1: Copy hoặc liên kết thư mục unityLibrary vào dự án Android của Flutter.</w:t>
+      </w:r>
+    </w:p>
+    <w:p>
+      <w:pPr>
+        <w:keepNext w:val="0"/>
+        <w:keepLines w:val="0"/>
+        <w:pageBreakBefore w:val="0"/>
+        <w:widowControl/>
+        <w:numPr>
+          <w:ilvl w:val="0"/>
+          <w:numId w:val="12"/>
+        </w:numPr>
+        <w:suppressLineNumbers w:val="0"/>
+        <w:kinsoku/>
+        <w:wordWrap/>
+        <w:overflowPunct/>
+        <w:topLinePunct w:val="0"/>
+        <w:autoSpaceDE/>
+        <w:autoSpaceDN/>
+        <w:bidi w:val="0"/>
+        <w:adjustRightInd/>
+        <w:snapToGrid/>
+        <w:spacing w:line="360" w:lineRule="auto"/>
+        <w:ind w:left="418" w:leftChars="0" w:hanging="309" w:firstLineChars="0"/>
+        <w:jc w:val="both"/>
+        <w:textAlignment w:val="auto"/>
+        <w:rPr>
+          <w:rFonts w:hint="default" w:ascii="Times New Roman" w:hAnsi="Times New Roman" w:cs="Times New Roman"/>
+          <w:sz w:val="24"/>
+          <w:szCs w:val="24"/>
+        </w:rPr>
+      </w:pPr>
+      <w:r>
+        <w:rPr>
+          <w:rFonts w:hint="default" w:ascii="Times New Roman" w:hAnsi="Times New Roman" w:eastAsia="SimSun" w:cs="Times New Roman"/>
+          <w:kern w:val="0"/>
+          <w:sz w:val="24"/>
+          <w:szCs w:val="24"/>
+          <w:lang w:val="en-US" w:eastAsia="zh-CN" w:bidi="ar"/>
+        </w:rPr>
+        <w:t>Bước 2: Khai báo Widget UnityWidget tại màn hình mong muốn trong Flutter.</w:t>
+      </w:r>
+    </w:p>
+    <w:p>
+      <w:pPr>
+        <w:keepNext w:val="0"/>
+        <w:keepLines w:val="0"/>
+        <w:pageBreakBefore w:val="0"/>
+        <w:widowControl/>
+        <w:numPr>
+          <w:ilvl w:val="0"/>
+          <w:numId w:val="12"/>
+        </w:numPr>
+        <w:suppressLineNumbers w:val="0"/>
+        <w:kinsoku/>
+        <w:wordWrap/>
+        <w:overflowPunct/>
+        <w:topLinePunct w:val="0"/>
+        <w:autoSpaceDE/>
+        <w:autoSpaceDN/>
+        <w:bidi w:val="0"/>
+        <w:adjustRightInd/>
+        <w:snapToGrid/>
+        <w:spacing w:line="360" w:lineRule="auto"/>
+        <w:ind w:left="418" w:leftChars="0" w:hanging="309" w:firstLineChars="0"/>
+        <w:jc w:val="both"/>
+        <w:textAlignment w:val="auto"/>
+        <w:rPr>
+          <w:rFonts w:hint="default" w:ascii="Times New Roman" w:hAnsi="Times New Roman" w:cs="Times New Roman"/>
+          <w:sz w:val="24"/>
+          <w:szCs w:val="24"/>
+        </w:rPr>
+      </w:pPr>
+      <w:r>
+        <w:rPr>
+          <w:rFonts w:hint="default" w:ascii="Times New Roman" w:hAnsi="Times New Roman" w:eastAsia="SimSun" w:cs="Times New Roman"/>
+          <w:kern w:val="0"/>
+          <w:sz w:val="24"/>
+          <w:szCs w:val="24"/>
+          <w:lang w:val="en-US" w:eastAsia="zh-CN" w:bidi="ar"/>
+        </w:rPr>
+        <w:t>Bước 3: Lập trình hàm onUnityCreated để hứng UnityWidgetController.</w:t>
+      </w:r>
+    </w:p>
+    <w:p>
+      <w:pPr>
+        <w:keepNext w:val="0"/>
+        <w:keepLines w:val="0"/>
+        <w:pageBreakBefore w:val="0"/>
+        <w:widowControl/>
+        <w:numPr>
+          <w:ilvl w:val="0"/>
+          <w:numId w:val="12"/>
+        </w:numPr>
+        <w:suppressLineNumbers w:val="0"/>
+        <w:kinsoku/>
+        <w:wordWrap/>
+        <w:overflowPunct/>
+        <w:topLinePunct w:val="0"/>
+        <w:autoSpaceDE/>
+        <w:autoSpaceDN/>
+        <w:bidi w:val="0"/>
+        <w:adjustRightInd/>
+        <w:snapToGrid/>
+        <w:spacing w:line="360" w:lineRule="auto"/>
+        <w:ind w:left="418" w:leftChars="0" w:hanging="309" w:firstLineChars="0"/>
+        <w:jc w:val="both"/>
+        <w:textAlignment w:val="auto"/>
+        <w:rPr>
+          <w:rFonts w:hint="default" w:ascii="Times New Roman" w:hAnsi="Times New Roman" w:cs="Times New Roman"/>
+          <w:sz w:val="24"/>
+          <w:szCs w:val="24"/>
+        </w:rPr>
+      </w:pPr>
+      <w:r>
+        <w:rPr>
+          <w:rFonts w:hint="default" w:ascii="Times New Roman" w:hAnsi="Times New Roman" w:eastAsia="SimSun" w:cs="Times New Roman"/>
+          <w:kern w:val="0"/>
+          <w:sz w:val="24"/>
+          <w:szCs w:val="24"/>
+          <w:lang w:val="en-US" w:eastAsia="zh-CN" w:bidi="ar"/>
+        </w:rPr>
+        <w:t>Bước 4: Xử lý hiển thị lớp phủ (Overlay) hoặc luồng khởi tạo ngầm Unity để tránh giật lag UI khi load.</w:t>
+      </w:r>
+    </w:p>
+    <w:p>
+      <w:pPr>
+        <w:keepNext w:val="0"/>
+        <w:keepLines w:val="0"/>
+        <w:pageBreakBefore w:val="0"/>
+        <w:widowControl/>
+        <w:numPr>
+          <w:ilvl w:val="0"/>
+          <w:numId w:val="12"/>
+        </w:numPr>
+        <w:suppressLineNumbers w:val="0"/>
+        <w:kinsoku/>
+        <w:wordWrap/>
+        <w:overflowPunct/>
+        <w:topLinePunct w:val="0"/>
+        <w:autoSpaceDE/>
+        <w:autoSpaceDN/>
+        <w:bidi w:val="0"/>
+        <w:adjustRightInd/>
+        <w:snapToGrid/>
+        <w:spacing w:line="360" w:lineRule="auto"/>
+        <w:ind w:left="418" w:leftChars="0" w:hanging="309" w:firstLineChars="0"/>
+        <w:jc w:val="both"/>
+        <w:textAlignment w:val="auto"/>
+        <w:rPr>
+          <w:rFonts w:hint="default" w:ascii="Times New Roman" w:hAnsi="Times New Roman" w:cs="Times New Roman"/>
+          <w:sz w:val="24"/>
+          <w:szCs w:val="24"/>
+        </w:rPr>
+      </w:pPr>
+      <w:r>
+        <w:rPr>
+          <w:rFonts w:hint="default" w:ascii="Times New Roman" w:hAnsi="Times New Roman" w:eastAsia="SimSun" w:cs="Times New Roman"/>
+          <w:kern w:val="0"/>
+          <w:sz w:val="24"/>
+          <w:szCs w:val="24"/>
+          <w:lang w:val="en-US" w:eastAsia="zh-CN" w:bidi="ar"/>
+        </w:rPr>
+        <w:t>Bước 5: Kiểm thử biên dịch cơ bản ứng dụng Flutter chứa Unity qua flutter run</w:t>
+      </w:r>
       <w:bookmarkStart w:id="0" w:name="_GoBack"/>
       <w:bookmarkEnd w:id="0"/>
     </w:p>
     <w:p>
       <w:pPr>
+        <w:keepNext w:val="0"/>
+        <w:keepLines w:val="0"/>
+        <w:widowControl/>
+        <w:suppressLineNumbers w:val="0"/>
+        <w:jc w:val="both"/>
+        <w:rPr>
+          <w:rFonts w:ascii="SimSun" w:hAnsi="SimSun" w:eastAsia="SimSun" w:cs="SimSun"/>
+          <w:kern w:val="0"/>
+          <w:sz w:val="24"/>
+          <w:szCs w:val="24"/>
+          <w:lang w:val="en-US" w:eastAsia="zh-CN" w:bidi="ar"/>
+        </w:rPr>
+      </w:pPr>
+    </w:p>
+    <w:p>
+      <w:pPr>
+        <w:keepNext w:val="0"/>
+        <w:keepLines w:val="0"/>
+        <w:pageBreakBefore w:val="0"/>
+        <w:widowControl/>
+        <w:numPr>
+          <w:numId w:val="0"/>
+        </w:numPr>
+        <w:kinsoku/>
+        <w:wordWrap/>
+        <w:overflowPunct/>
+        <w:topLinePunct w:val="0"/>
+        <w:autoSpaceDE/>
+        <w:autoSpaceDN/>
         <w:bidi w:val="0"/>
+        <w:adjustRightInd/>
+        <w:snapToGrid/>
+        <w:spacing w:line="360" w:lineRule="auto"/>
+        <w:ind w:leftChars="0"/>
+        <w:jc w:val="both"/>
+        <w:textAlignment w:val="auto"/>
+        <w:rPr>
+          <w:rFonts w:hint="default" w:ascii="Times New Roman" w:hAnsi="Times New Roman" w:cs="Times New Roman"/>
+          <w:b/>
+          <w:bCs/>
+          <w:sz w:val="24"/>
+          <w:szCs w:val="24"/>
+          <w:lang w:val="vi-VN"/>
+        </w:rPr>
+      </w:pPr>
+    </w:p>
+    <w:p>
+      <w:pPr>
+        <w:keepNext w:val="0"/>
+        <w:keepLines w:val="0"/>
+        <w:pageBreakBefore w:val="0"/>
+        <w:widowControl/>
+        <w:numPr>
+          <w:numId w:val="0"/>
+        </w:numPr>
+        <w:kinsoku/>
+        <w:wordWrap/>
+        <w:overflowPunct/>
+        <w:topLinePunct w:val="0"/>
+        <w:autoSpaceDE/>
+        <w:autoSpaceDN/>
+        <w:bidi w:val="0"/>
+        <w:adjustRightInd/>
+        <w:snapToGrid/>
+        <w:spacing w:line="360" w:lineRule="auto"/>
+        <w:ind w:leftChars="0"/>
+        <w:jc w:val="both"/>
+        <w:textAlignment w:val="auto"/>
+        <w:rPr>
+          <w:rFonts w:hint="default" w:ascii="Times New Roman" w:hAnsi="Times New Roman" w:cs="Times New Roman"/>
+          <w:b/>
+          <w:bCs/>
+          <w:sz w:val="24"/>
+          <w:szCs w:val="24"/>
+          <w:lang w:val="vi-VN"/>
+        </w:rPr>
+      </w:pPr>
+    </w:p>
+    <w:p>
+      <w:pPr>
+        <w:keepNext w:val="0"/>
+        <w:keepLines w:val="0"/>
+        <w:pageBreakBefore w:val="0"/>
+        <w:widowControl/>
+        <w:kinsoku/>
+        <w:wordWrap/>
+        <w:overflowPunct/>
+        <w:topLinePunct w:val="0"/>
+        <w:autoSpaceDE/>
+        <w:autoSpaceDN/>
+        <w:bidi w:val="0"/>
+        <w:adjustRightInd/>
+        <w:snapToGrid/>
+        <w:spacing w:line="360" w:lineRule="auto"/>
+        <w:jc w:val="both"/>
+        <w:textAlignment w:val="auto"/>
         <w:rPr>
           <w:rFonts w:hint="default" w:ascii="Times New Roman" w:hAnsi="Times New Roman" w:cs="Times New Roman"/>
           <w:sz w:val="24"/>
@@ -420,6 +3008,26 @@
       </w:rPr>
     </w:lvl>
   </w:abstractNum>
+  <w:abstractNum w:abstractNumId="11">
+    <w:nsid w:val="6E77415A"/>
+    <w:multiLevelType w:val="singleLevel"/>
+    <w:tmpl w:val="6E77415A"/>
+    <w:lvl w:ilvl="0" w:tentative="0">
+      <w:start w:val="1"/>
+      <w:numFmt w:val="bullet"/>
+      <w:lvlText w:val="•"/>
+      <w:lvlJc w:val="left"/>
+      <w:pPr>
+        <w:tabs>
+          <w:tab w:val="left" w:pos="420"/>
+        </w:tabs>
+        <w:ind w:left="418" w:leftChars="0" w:hanging="309" w:firstLineChars="0"/>
+      </w:pPr>
+      <w:rPr>
+        <w:rFonts w:hint="default" w:ascii="Arial" w:hAnsi="Arial" w:cs="Arial"/>
+      </w:rPr>
+    </w:lvl>
+  </w:abstractNum>
   <w:num w:numId="1">
     <w:abstractNumId w:val="10"/>
   </w:num>
@@ -452,6 +3060,9 @@
   </w:num>
   <w:num w:numId="11">
     <w:abstractNumId w:val="0"/>
+  </w:num>
+  <w:num w:numId="12">
+    <w:abstractNumId w:val="11"/>
   </w:num>
 </w:numbering>
 </file>
@@ -509,11 +3120,11 @@
     <w:lsdException w:qFormat="1" w:unhideWhenUsed="0" w:uiPriority="0" w:semiHidden="0" w:name="annotation reference"/>
     <w:lsdException w:qFormat="1" w:unhideWhenUsed="0" w:uiPriority="0" w:semiHidden="0" w:name="line number"/>
     <w:lsdException w:unhideWhenUsed="0" w:uiPriority="0" w:semiHidden="0" w:name="page number"/>
-    <w:lsdException w:unhideWhenUsed="0" w:uiPriority="0" w:semiHidden="0" w:name="endnote reference"/>
+    <w:lsdException w:qFormat="1" w:unhideWhenUsed="0" w:uiPriority="0" w:semiHidden="0" w:name="endnote reference"/>
     <w:lsdException w:qFormat="1" w:unhideWhenUsed="0" w:uiPriority="0" w:semiHidden="0" w:name="endnote text"/>
     <w:lsdException w:unhideWhenUsed="0" w:uiPriority="0" w:semiHidden="0" w:name="table of authorities"/>
     <w:lsdException w:qFormat="1" w:unhideWhenUsed="0" w:uiPriority="0" w:semiHidden="0" w:name="macro"/>
-    <w:lsdException w:unhideWhenUsed="0" w:uiPriority="0" w:semiHidden="0" w:name="toa heading"/>
+    <w:lsdException w:qFormat="1" w:unhideWhenUsed="0" w:uiPriority="0" w:semiHidden="0" w:name="toa heading"/>
     <w:lsdException w:qFormat="1" w:unhideWhenUsed="0" w:uiPriority="0" w:semiHidden="0" w:name="List"/>
     <w:lsdException w:qFormat="1" w:unhideWhenUsed="0" w:uiPriority="0" w:semiHidden="0" w:name="List Bullet"/>
     <w:lsdException w:qFormat="1" w:unhideWhenUsed="0" w:uiPriority="0" w:semiHidden="0" w:name="List Number"/>
@@ -532,7 +3143,7 @@
     <w:lsdException w:qFormat="1" w:unhideWhenUsed="0" w:uiPriority="0" w:semiHidden="0" w:name="Title"/>
     <w:lsdException w:qFormat="1" w:unhideWhenUsed="0" w:uiPriority="0" w:semiHidden="0" w:name="Closing"/>
     <w:lsdException w:unhideWhenUsed="0" w:uiPriority="0" w:semiHidden="0" w:name="Signature"/>
-    <w:lsdException w:unhideWhenUsed="0" w:uiPriority="0" w:name="Default Paragraph Font"/>
+    <w:lsdException w:qFormat="1" w:unhideWhenUsed="0" w:uiPriority="0" w:name="Default Paragraph Font"/>
     <w:lsdException w:qFormat="1" w:unhideWhenUsed="0" w:uiPriority="0" w:semiHidden="0" w:name="Body Text"/>
     <w:lsdException w:qFormat="1" w:unhideWhenUsed="0" w:uiPriority="0" w:semiHidden="0" w:name="Body Text Indent"/>
     <w:lsdException w:unhideWhenUsed="0" w:uiPriority="0" w:semiHidden="0" w:name="List Continue"/>
@@ -544,11 +3155,11 @@
     <w:lsdException w:qFormat="1" w:unhideWhenUsed="0" w:uiPriority="0" w:semiHidden="0" w:name="Subtitle"/>
     <w:lsdException w:qFormat="1" w:unhideWhenUsed="0" w:uiPriority="0" w:semiHidden="0" w:name="Salutation"/>
     <w:lsdException w:qFormat="1" w:unhideWhenUsed="0" w:uiPriority="0" w:semiHidden="0" w:name="Date"/>
-    <w:lsdException w:unhideWhenUsed="0" w:uiPriority="0" w:semiHidden="0" w:name="Body Text First Indent"/>
-    <w:lsdException w:unhideWhenUsed="0" w:uiPriority="0" w:semiHidden="0" w:name="Body Text First Indent 2"/>
+    <w:lsdException w:qFormat="1" w:unhideWhenUsed="0" w:uiPriority="0" w:semiHidden="0" w:name="Body Text First Indent"/>
+    <w:lsdException w:qFormat="1" w:unhideWhenUsed="0" w:uiPriority="0" w:semiHidden="0" w:name="Body Text First Indent 2"/>
     <w:lsdException w:qFormat="1" w:unhideWhenUsed="0" w:uiPriority="0" w:semiHidden="0" w:name="Note Heading"/>
     <w:lsdException w:qFormat="1" w:unhideWhenUsed="0" w:uiPriority="0" w:semiHidden="0" w:name="Body Text 2"/>
-    <w:lsdException w:unhideWhenUsed="0" w:uiPriority="0" w:semiHidden="0" w:name="Body Text 3"/>
+    <w:lsdException w:qFormat="1" w:unhideWhenUsed="0" w:uiPriority="0" w:semiHidden="0" w:name="Body Text 3"/>
     <w:lsdException w:qFormat="1" w:unhideWhenUsed="0" w:uiPriority="0" w:semiHidden="0" w:name="Body Text Indent 2"/>
     <w:lsdException w:qFormat="1" w:unhideWhenUsed="0" w:uiPriority="0" w:semiHidden="0" w:name="Body Text Indent 3"/>
     <w:lsdException w:qFormat="1" w:unhideWhenUsed="0" w:uiPriority="0" w:semiHidden="0" w:name="Block Text"/>
@@ -556,14 +3167,14 @@
     <w:lsdException w:unhideWhenUsed="0" w:uiPriority="0" w:semiHidden="0" w:name="FollowedHyperlink"/>
     <w:lsdException w:qFormat="1" w:unhideWhenUsed="0" w:uiPriority="0" w:semiHidden="0" w:name="Strong"/>
     <w:lsdException w:qFormat="1" w:unhideWhenUsed="0" w:uiPriority="0" w:semiHidden="0" w:name="Emphasis"/>
-    <w:lsdException w:unhideWhenUsed="0" w:uiPriority="0" w:semiHidden="0" w:name="Document Map"/>
+    <w:lsdException w:qFormat="1" w:unhideWhenUsed="0" w:uiPriority="0" w:semiHidden="0" w:name="Document Map"/>
     <w:lsdException w:qFormat="1" w:unhideWhenUsed="0" w:uiPriority="0" w:semiHidden="0" w:name="Plain Text"/>
     <w:lsdException w:qFormat="1" w:unhideWhenUsed="0" w:uiPriority="0" w:semiHidden="0" w:name="E-mail Signature"/>
     <w:lsdException w:qFormat="1" w:unhideWhenUsed="0" w:uiPriority="0" w:semiHidden="0" w:name="Normal (Web)"/>
     <w:lsdException w:qFormat="1" w:unhideWhenUsed="0" w:uiPriority="0" w:semiHidden="0" w:name="HTML Acronym"/>
     <w:lsdException w:qFormat="1" w:unhideWhenUsed="0" w:uiPriority="0" w:semiHidden="0" w:name="HTML Address"/>
     <w:lsdException w:qFormat="1" w:unhideWhenUsed="0" w:uiPriority="0" w:semiHidden="0" w:name="HTML Cite"/>
-    <w:lsdException w:unhideWhenUsed="0" w:uiPriority="0" w:semiHidden="0" w:name="HTML Code"/>
+    <w:lsdException w:qFormat="1" w:unhideWhenUsed="0" w:uiPriority="0" w:semiHidden="0" w:name="HTML Code"/>
     <w:lsdException w:qFormat="1" w:unhideWhenUsed="0" w:uiPriority="0" w:semiHidden="0" w:name="HTML Definition"/>
     <w:lsdException w:qFormat="1" w:unhideWhenUsed="0" w:uiPriority="0" w:semiHidden="0" w:name="HTML Keyboard"/>
     <w:lsdException w:qFormat="1" w:unhideWhenUsed="0" w:uiPriority="0" w:semiHidden="0" w:name="HTML Preformatted"/>
@@ -616,7 +3227,7 @@
     <w:lsdException w:qFormat="1" w:unhideWhenUsed="0" w:uiPriority="0" w:semiHidden="0" w:name="Table Web 3"/>
     <w:lsdException w:qFormat="1" w:unhideWhenUsed="0" w:uiPriority="0" w:semiHidden="0" w:name="Balloon Text"/>
     <w:lsdException w:unhideWhenUsed="0" w:uiPriority="0" w:semiHidden="0" w:name="Table Grid"/>
-    <w:lsdException w:unhideWhenUsed="0" w:uiPriority="0" w:semiHidden="0" w:name="Table Theme"/>
+    <w:lsdException w:qFormat="1" w:unhideWhenUsed="0" w:uiPriority="0" w:semiHidden="0" w:name="Table Theme"/>
     <w:lsdException w:qFormat="1" w:unhideWhenUsed="0" w:uiPriority="60" w:semiHidden="0" w:name="Light Shading"/>
     <w:lsdException w:unhideWhenUsed="0" w:uiPriority="61" w:semiHidden="0" w:name="Light List"/>
     <w:lsdException w:unhideWhenUsed="0" w:uiPriority="62" w:semiHidden="0" w:name="Light Grid"/>
@@ -911,6 +3522,7 @@
   <w:style w:type="character" w:default="1" w:styleId="11">
     <w:name w:val="Default Paragraph Font"/>
     <w:semiHidden/>
+    <w:qFormat/>
     <w:uiPriority w:val="0"/>
   </w:style>
   <w:style w:type="table" w:default="1" w:styleId="12">
@@ -967,6 +3579,7 @@
   <w:style w:type="paragraph" w:styleId="17">
     <w:name w:val="Body Text 3"/>
     <w:basedOn w:val="1"/>
+    <w:qFormat/>
     <w:uiPriority w:val="0"/>
     <w:pPr>
       <w:spacing w:after="120"/>
@@ -979,6 +3592,7 @@
   <w:style w:type="paragraph" w:styleId="18">
     <w:name w:val="Body Text First Indent"/>
     <w:basedOn w:val="15"/>
+    <w:qFormat/>
     <w:uiPriority w:val="0"/>
     <w:pPr>
       <w:ind w:firstLine="420" w:firstLineChars="100"/>
@@ -997,6 +3611,7 @@
   <w:style w:type="paragraph" w:styleId="20">
     <w:name w:val="Body Text First Indent 2"/>
     <w:basedOn w:val="19"/>
+    <w:qFormat/>
     <w:uiPriority w:val="0"/>
     <w:pPr>
       <w:ind w:firstLine="420" w:firstLineChars="200"/>
@@ -1091,6 +3706,7 @@
   <w:style w:type="paragraph" w:styleId="29">
     <w:name w:val="Document Map"/>
     <w:basedOn w:val="1"/>
+    <w:qFormat/>
     <w:uiPriority w:val="0"/>
     <w:pPr>
       <w:shd w:val="clear" w:color="auto" w:fill="000080"/>
@@ -1115,6 +3731,7 @@
   <w:style w:type="character" w:styleId="32">
     <w:name w:val="endnote reference"/>
     <w:basedOn w:val="11"/>
+    <w:qFormat/>
     <w:uiPriority w:val="0"/>
     <w:rPr>
       <w:vertAlign w:val="superscript"/>
@@ -1252,6 +3869,7 @@
   <w:style w:type="character" w:styleId="44">
     <w:name w:val="HTML Code"/>
     <w:basedOn w:val="11"/>
+    <w:qFormat/>
     <w:uiPriority w:val="0"/>
     <w:rPr>
       <w:rFonts w:ascii="Courier New" w:hAnsi="Courier New" w:cs="Courier New"/>
@@ -4752,6 +7370,7 @@
   <w:style w:type="table" w:styleId="136">
     <w:name w:val="Table Theme"/>
     <w:basedOn w:val="12"/>
+    <w:qFormat/>
     <w:uiPriority w:val="0"/>
     <w:pPr>
       <w:widowControl w:val="0"/>
@@ -4906,6 +7525,7 @@
     <w:name w:val="toa heading"/>
     <w:basedOn w:val="1"/>
     <w:next w:val="1"/>
+    <w:qFormat/>
     <w:uiPriority w:val="0"/>
     <w:pPr>
       <w:spacing w:before="120"/>

</xml_diff>

<commit_message>
Huong dan và link project demo
</commit_message>
<xml_diff>
--- a/Quy_trinh.docx
+++ b/Quy_trinh.docx
@@ -321,6 +321,7 @@
         <w:pageBreakBefore w:val="0"/>
         <w:widowControl/>
         <w:numPr>
+          <w:ilvl w:val="0"/>
           <w:numId w:val="0"/>
         </w:numPr>
         <w:kinsoku/>
@@ -392,6 +393,7 @@
         <w:pageBreakBefore w:val="0"/>
         <w:widowControl/>
         <w:numPr>
+          <w:ilvl w:val="0"/>
           <w:numId w:val="0"/>
         </w:numPr>
         <w:kinsoku/>
@@ -2670,10 +2672,105 @@
           <w:szCs w:val="24"/>
           <w:lang w:val="en-US" w:eastAsia="zh-CN" w:bidi="ar"/>
         </w:rPr>
-        <w:t>Bước 5: Kiểm thử biên dịch cơ bản ứng dụng Flutter chứa Unity qua flutter run</w:t>
+        <w:t xml:space="preserve">Bước 5: Kiểm thử biên dịch cơ bản ứng dụng </w:t>
       </w:r>
       <w:bookmarkStart w:id="0" w:name="_GoBack"/>
       <w:bookmarkEnd w:id="0"/>
+      <w:r>
+        <w:rPr>
+          <w:rFonts w:hint="default" w:ascii="Times New Roman" w:hAnsi="Times New Roman" w:eastAsia="SimSun" w:cs="Times New Roman"/>
+          <w:kern w:val="0"/>
+          <w:sz w:val="24"/>
+          <w:szCs w:val="24"/>
+          <w:lang w:val="en-US" w:eastAsia="zh-CN" w:bidi="ar"/>
+        </w:rPr>
+        <w:t>Flutter chứa Unity qua flutter run</w:t>
+      </w:r>
+    </w:p>
+    <w:p>
+      <w:pPr>
+        <w:keepNext w:val="0"/>
+        <w:keepLines w:val="0"/>
+        <w:pageBreakBefore w:val="0"/>
+        <w:widowControl/>
+        <w:numPr>
+          <w:numId w:val="0"/>
+        </w:numPr>
+        <w:suppressLineNumbers w:val="0"/>
+        <w:kinsoku/>
+        <w:wordWrap/>
+        <w:overflowPunct/>
+        <w:topLinePunct w:val="0"/>
+        <w:autoSpaceDE/>
+        <w:autoSpaceDN/>
+        <w:bidi w:val="0"/>
+        <w:adjustRightInd/>
+        <w:snapToGrid/>
+        <w:spacing w:line="360" w:lineRule="auto"/>
+        <w:jc w:val="both"/>
+        <w:textAlignment w:val="auto"/>
+        <w:rPr>
+          <w:rFonts w:hint="default" w:ascii="Times New Roman" w:hAnsi="Times New Roman" w:eastAsia="SimSun" w:cs="Times New Roman"/>
+          <w:b/>
+          <w:bCs/>
+          <w:kern w:val="0"/>
+          <w:sz w:val="24"/>
+          <w:szCs w:val="24"/>
+          <w:lang w:val="en-US" w:eastAsia="zh-CN" w:bidi="ar"/>
+        </w:rPr>
+      </w:pPr>
+      <w:r>
+        <w:rPr>
+          <w:rFonts w:hint="default" w:ascii="Times New Roman" w:hAnsi="Times New Roman" w:eastAsia="SimSun" w:cs="Times New Roman"/>
+          <w:b/>
+          <w:bCs/>
+          <w:kern w:val="0"/>
+          <w:sz w:val="24"/>
+          <w:szCs w:val="24"/>
+          <w:lang w:val="en-US" w:eastAsia="zh-CN" w:bidi="ar"/>
+        </w:rPr>
+        <w:t>LINK DRIVE PROJECT DEMO:</w:t>
+      </w:r>
+    </w:p>
+    <w:p>
+      <w:pPr>
+        <w:keepNext w:val="0"/>
+        <w:keepLines w:val="0"/>
+        <w:pageBreakBefore w:val="0"/>
+        <w:widowControl/>
+        <w:numPr>
+          <w:numId w:val="0"/>
+        </w:numPr>
+        <w:suppressLineNumbers w:val="0"/>
+        <w:kinsoku/>
+        <w:wordWrap/>
+        <w:overflowPunct/>
+        <w:topLinePunct w:val="0"/>
+        <w:autoSpaceDE/>
+        <w:autoSpaceDN/>
+        <w:bidi w:val="0"/>
+        <w:adjustRightInd/>
+        <w:snapToGrid/>
+        <w:spacing w:line="360" w:lineRule="auto"/>
+        <w:jc w:val="both"/>
+        <w:textAlignment w:val="auto"/>
+        <w:rPr>
+          <w:rFonts w:hint="default" w:ascii="Times New Roman" w:hAnsi="Times New Roman" w:cs="Times New Roman"/>
+          <w:sz w:val="24"/>
+          <w:szCs w:val="24"/>
+          <w:lang w:val="en-US"/>
+        </w:rPr>
+      </w:pPr>
+      <w:r>
+        <w:rPr>
+          <w:rFonts w:hint="default" w:ascii="Times New Roman" w:hAnsi="Times New Roman" w:eastAsia="SimSun" w:cs="Times New Roman"/>
+          <w:kern w:val="0"/>
+          <w:sz w:val="24"/>
+          <w:szCs w:val="24"/>
+          <w:lang w:val="en-US" w:eastAsia="zh-CN" w:bidi="ar"/>
+        </w:rPr>
+        <w:t>https://drive.google.com/file/d/1XulzVecMVW0NWGh_j4sT1yLWe_9KtkRO/view?usp=sharing</w:t>
+      </w:r>
     </w:p>
     <w:p>
       <w:pPr>
@@ -2698,6 +2795,7 @@
         <w:pageBreakBefore w:val="0"/>
         <w:widowControl/>
         <w:numPr>
+          <w:ilvl w:val="0"/>
           <w:numId w:val="0"/>
         </w:numPr>
         <w:kinsoku/>
@@ -2730,6 +2828,7 @@
         <w:pageBreakBefore w:val="0"/>
         <w:widowControl/>
         <w:numPr>
+          <w:ilvl w:val="0"/>
           <w:numId w:val="0"/>
         </w:numPr>
         <w:kinsoku/>
@@ -3094,8 +3193,8 @@
     <w:lsdException w:qFormat="1" w:unhideWhenUsed="0" w:uiPriority="0" w:semiHidden="0" w:name="index 4"/>
     <w:lsdException w:qFormat="1" w:unhideWhenUsed="0" w:uiPriority="0" w:semiHidden="0" w:name="index 5"/>
     <w:lsdException w:qFormat="1" w:unhideWhenUsed="0" w:uiPriority="0" w:semiHidden="0" w:name="index 6"/>
-    <w:lsdException w:unhideWhenUsed="0" w:uiPriority="0" w:semiHidden="0" w:name="index 7"/>
-    <w:lsdException w:unhideWhenUsed="0" w:uiPriority="0" w:semiHidden="0" w:name="index 8"/>
+    <w:lsdException w:qFormat="1" w:unhideWhenUsed="0" w:uiPriority="0" w:semiHidden="0" w:name="index 7"/>
+    <w:lsdException w:qFormat="1" w:unhideWhenUsed="0" w:uiPriority="0" w:semiHidden="0" w:name="index 8"/>
     <w:lsdException w:qFormat="1" w:unhideWhenUsed="0" w:uiPriority="0" w:semiHidden="0" w:name="index 9"/>
     <w:lsdException w:unhideWhenUsed="0" w:uiPriority="0" w:semiHidden="0" w:name="toc 1"/>
     <w:lsdException w:qFormat="1" w:unhideWhenUsed="0" w:uiPriority="0" w:semiHidden="0" w:name="toc 2"/>
@@ -3106,7 +3205,7 @@
     <w:lsdException w:unhideWhenUsed="0" w:uiPriority="0" w:semiHidden="0" w:name="toc 7"/>
     <w:lsdException w:qFormat="1" w:unhideWhenUsed="0" w:uiPriority="0" w:semiHidden="0" w:name="toc 8"/>
     <w:lsdException w:unhideWhenUsed="0" w:uiPriority="0" w:semiHidden="0" w:name="toc 9"/>
-    <w:lsdException w:unhideWhenUsed="0" w:uiPriority="0" w:semiHidden="0" w:name="Normal Indent"/>
+    <w:lsdException w:qFormat="1" w:unhideWhenUsed="0" w:uiPriority="0" w:semiHidden="0" w:name="Normal Indent"/>
     <w:lsdException w:unhideWhenUsed="0" w:uiPriority="0" w:semiHidden="0" w:name="footnote text"/>
     <w:lsdException w:qFormat="1" w:unhideWhenUsed="0" w:uiPriority="0" w:semiHidden="0" w:name="annotation text"/>
     <w:lsdException w:qFormat="1" w:unhideWhenUsed="0" w:uiPriority="0" w:semiHidden="0" w:name="header"/>
@@ -3119,7 +3218,7 @@
     <w:lsdException w:qFormat="1" w:unhideWhenUsed="0" w:uiPriority="0" w:semiHidden="0" w:name="footnote reference"/>
     <w:lsdException w:qFormat="1" w:unhideWhenUsed="0" w:uiPriority="0" w:semiHidden="0" w:name="annotation reference"/>
     <w:lsdException w:qFormat="1" w:unhideWhenUsed="0" w:uiPriority="0" w:semiHidden="0" w:name="line number"/>
-    <w:lsdException w:unhideWhenUsed="0" w:uiPriority="0" w:semiHidden="0" w:name="page number"/>
+    <w:lsdException w:qFormat="1" w:unhideWhenUsed="0" w:uiPriority="0" w:semiHidden="0" w:name="page number"/>
     <w:lsdException w:qFormat="1" w:unhideWhenUsed="0" w:uiPriority="0" w:semiHidden="0" w:name="endnote reference"/>
     <w:lsdException w:qFormat="1" w:unhideWhenUsed="0" w:uiPriority="0" w:semiHidden="0" w:name="endnote text"/>
     <w:lsdException w:unhideWhenUsed="0" w:uiPriority="0" w:semiHidden="0" w:name="table of authorities"/>
@@ -3130,25 +3229,25 @@
     <w:lsdException w:qFormat="1" w:unhideWhenUsed="0" w:uiPriority="0" w:semiHidden="0" w:name="List Number"/>
     <w:lsdException w:qFormat="1" w:unhideWhenUsed="0" w:uiPriority="0" w:semiHidden="0" w:name="List 2"/>
     <w:lsdException w:qFormat="1" w:unhideWhenUsed="0" w:uiPriority="0" w:semiHidden="0" w:name="List 3"/>
-    <w:lsdException w:unhideWhenUsed="0" w:uiPriority="0" w:semiHidden="0" w:name="List 4"/>
+    <w:lsdException w:qFormat="1" w:unhideWhenUsed="0" w:uiPriority="0" w:semiHidden="0" w:name="List 4"/>
     <w:lsdException w:qFormat="1" w:unhideWhenUsed="0" w:uiPriority="0" w:semiHidden="0" w:name="List 5"/>
     <w:lsdException w:qFormat="1" w:unhideWhenUsed="0" w:uiPriority="0" w:semiHidden="0" w:name="List Bullet 2"/>
     <w:lsdException w:qFormat="1" w:unhideWhenUsed="0" w:uiPriority="0" w:semiHidden="0" w:name="List Bullet 3"/>
     <w:lsdException w:qFormat="1" w:unhideWhenUsed="0" w:uiPriority="0" w:semiHidden="0" w:name="List Bullet 4"/>
     <w:lsdException w:qFormat="1" w:unhideWhenUsed="0" w:uiPriority="0" w:semiHidden="0" w:name="List Bullet 5"/>
     <w:lsdException w:qFormat="1" w:unhideWhenUsed="0" w:uiPriority="0" w:semiHidden="0" w:name="List Number 2"/>
-    <w:lsdException w:unhideWhenUsed="0" w:uiPriority="0" w:semiHidden="0" w:name="List Number 3"/>
+    <w:lsdException w:qFormat="1" w:unhideWhenUsed="0" w:uiPriority="0" w:semiHidden="0" w:name="List Number 3"/>
     <w:lsdException w:qFormat="1" w:unhideWhenUsed="0" w:uiPriority="0" w:semiHidden="0" w:name="List Number 4"/>
     <w:lsdException w:qFormat="1" w:unhideWhenUsed="0" w:uiPriority="0" w:semiHidden="0" w:name="List Number 5"/>
     <w:lsdException w:qFormat="1" w:unhideWhenUsed="0" w:uiPriority="0" w:semiHidden="0" w:name="Title"/>
     <w:lsdException w:qFormat="1" w:unhideWhenUsed="0" w:uiPriority="0" w:semiHidden="0" w:name="Closing"/>
-    <w:lsdException w:unhideWhenUsed="0" w:uiPriority="0" w:semiHidden="0" w:name="Signature"/>
+    <w:lsdException w:qFormat="1" w:unhideWhenUsed="0" w:uiPriority="0" w:semiHidden="0" w:name="Signature"/>
     <w:lsdException w:qFormat="1" w:unhideWhenUsed="0" w:uiPriority="0" w:name="Default Paragraph Font"/>
     <w:lsdException w:qFormat="1" w:unhideWhenUsed="0" w:uiPriority="0" w:semiHidden="0" w:name="Body Text"/>
     <w:lsdException w:qFormat="1" w:unhideWhenUsed="0" w:uiPriority="0" w:semiHidden="0" w:name="Body Text Indent"/>
-    <w:lsdException w:unhideWhenUsed="0" w:uiPriority="0" w:semiHidden="0" w:name="List Continue"/>
+    <w:lsdException w:qFormat="1" w:unhideWhenUsed="0" w:uiPriority="0" w:semiHidden="0" w:name="List Continue"/>
     <w:lsdException w:qFormat="1" w:unhideWhenUsed="0" w:uiPriority="0" w:semiHidden="0" w:name="List Continue 2"/>
-    <w:lsdException w:unhideWhenUsed="0" w:uiPriority="0" w:semiHidden="0" w:name="List Continue 3"/>
+    <w:lsdException w:qFormat="1" w:unhideWhenUsed="0" w:uiPriority="0" w:semiHidden="0" w:name="List Continue 3"/>
     <w:lsdException w:qFormat="1" w:unhideWhenUsed="0" w:uiPriority="0" w:semiHidden="0" w:name="List Continue 4"/>
     <w:lsdException w:qFormat="1" w:unhideWhenUsed="0" w:uiPriority="0" w:semiHidden="0" w:name="List Continue 5"/>
     <w:lsdException w:unhideWhenUsed="0" w:uiPriority="0" w:semiHidden="0" w:name="Message Header"/>
@@ -3186,11 +3285,11 @@
     <w:lsdException w:qFormat="1" w:unhideWhenUsed="0" w:uiPriority="0" w:semiHidden="0" w:name="Table Simple 1"/>
     <w:lsdException w:unhideWhenUsed="0" w:uiPriority="0" w:semiHidden="0" w:name="Table Simple 2"/>
     <w:lsdException w:qFormat="1" w:unhideWhenUsed="0" w:uiPriority="0" w:semiHidden="0" w:name="Table Simple 3"/>
-    <w:lsdException w:unhideWhenUsed="0" w:uiPriority="0" w:semiHidden="0" w:name="Table Classic 1"/>
+    <w:lsdException w:qFormat="1" w:unhideWhenUsed="0" w:uiPriority="0" w:semiHidden="0" w:name="Table Classic 1"/>
     <w:lsdException w:qFormat="1" w:unhideWhenUsed="0" w:uiPriority="0" w:semiHidden="0" w:name="Table Classic 2"/>
     <w:lsdException w:qFormat="1" w:unhideWhenUsed="0" w:uiPriority="0" w:semiHidden="0" w:name="Table Classic 3"/>
     <w:lsdException w:qFormat="1" w:unhideWhenUsed="0" w:uiPriority="0" w:semiHidden="0" w:name="Table Classic 4"/>
-    <w:lsdException w:unhideWhenUsed="0" w:uiPriority="0" w:semiHidden="0" w:name="Table Colorful 1"/>
+    <w:lsdException w:qFormat="1" w:unhideWhenUsed="0" w:uiPriority="0" w:semiHidden="0" w:name="Table Colorful 1"/>
     <w:lsdException w:qFormat="1" w:unhideWhenUsed="0" w:uiPriority="0" w:semiHidden="0" w:name="Table Colorful 2"/>
     <w:lsdException w:qFormat="1" w:unhideWhenUsed="0" w:uiPriority="0" w:semiHidden="0" w:name="Table Colorful 3"/>
     <w:lsdException w:unhideWhenUsed="0" w:uiPriority="0" w:semiHidden="0" w:name="Table Columns 1"/>
@@ -3214,7 +3313,7 @@
     <w:lsdException w:qFormat="1" w:unhideWhenUsed="0" w:uiPriority="0" w:semiHidden="0" w:name="Table List 6"/>
     <w:lsdException w:unhideWhenUsed="0" w:uiPriority="0" w:semiHidden="0" w:name="Table List 7"/>
     <w:lsdException w:qFormat="1" w:unhideWhenUsed="0" w:uiPriority="0" w:semiHidden="0" w:name="Table List 8"/>
-    <w:lsdException w:unhideWhenUsed="0" w:uiPriority="0" w:semiHidden="0" w:name="Table 3D effects 1"/>
+    <w:lsdException w:qFormat="1" w:unhideWhenUsed="0" w:uiPriority="0" w:semiHidden="0" w:name="Table 3D effects 1"/>
     <w:lsdException w:qFormat="1" w:unhideWhenUsed="0" w:uiPriority="0" w:semiHidden="0" w:name="Table 3D effects 2"/>
     <w:lsdException w:qFormat="1" w:unhideWhenUsed="0" w:uiPriority="0" w:semiHidden="0" w:name="Table 3D effects 3"/>
     <w:lsdException w:qFormat="1" w:unhideWhenUsed="0" w:uiPriority="0" w:semiHidden="0" w:name="Table Contemporary"/>
@@ -4009,6 +4108,7 @@
     <w:name w:val="index 7"/>
     <w:basedOn w:val="1"/>
     <w:next w:val="1"/>
+    <w:qFormat/>
     <w:uiPriority w:val="0"/>
     <w:pPr>
       <w:ind w:left="1200" w:leftChars="1200"/>
@@ -4018,6 +4118,7 @@
     <w:name w:val="index 8"/>
     <w:basedOn w:val="1"/>
     <w:next w:val="1"/>
+    <w:qFormat/>
     <w:uiPriority w:val="0"/>
     <w:pPr>
       <w:ind w:left="1400" w:leftChars="1400"/>
@@ -4081,6 +4182,7 @@
   <w:style w:type="paragraph" w:styleId="66">
     <w:name w:val="List 4"/>
     <w:basedOn w:val="1"/>
+    <w:qFormat/>
     <w:uiPriority w:val="0"/>
     <w:pPr>
       <w:ind w:left="100" w:leftChars="600" w:hanging="200" w:hangingChars="200"/>
@@ -4158,6 +4260,7 @@
   <w:style w:type="paragraph" w:styleId="73">
     <w:name w:val="List Continue"/>
     <w:basedOn w:val="1"/>
+    <w:qFormat/>
     <w:uiPriority w:val="0"/>
     <w:pPr>
       <w:spacing w:after="120"/>
@@ -4177,6 +4280,7 @@
   <w:style w:type="paragraph" w:styleId="75">
     <w:name w:val="List Continue 3"/>
     <w:basedOn w:val="1"/>
+    <w:qFormat/>
     <w:uiPriority w:val="0"/>
     <w:pPr>
       <w:spacing w:after="120"/>
@@ -4230,6 +4334,7 @@
   <w:style w:type="paragraph" w:styleId="80">
     <w:name w:val="List Number 3"/>
     <w:basedOn w:val="1"/>
+    <w:qFormat/>
     <w:uiPriority w:val="0"/>
     <w:pPr>
       <w:numPr>
@@ -4326,6 +4431,7 @@
   <w:style w:type="paragraph" w:styleId="86">
     <w:name w:val="Normal Indent"/>
     <w:basedOn w:val="1"/>
+    <w:qFormat/>
     <w:uiPriority w:val="0"/>
     <w:pPr>
       <w:ind w:firstLine="420" w:firstLineChars="200"/>
@@ -4344,6 +4450,7 @@
   <w:style w:type="character" w:styleId="88">
     <w:name w:val="page number"/>
     <w:basedOn w:val="11"/>
+    <w:qFormat/>
     <w:uiPriority w:val="0"/>
   </w:style>
   <w:style w:type="paragraph" w:styleId="89">
@@ -4366,6 +4473,7 @@
   <w:style w:type="paragraph" w:styleId="91">
     <w:name w:val="Signature"/>
     <w:basedOn w:val="1"/>
+    <w:qFormat/>
     <w:uiPriority w:val="0"/>
     <w:pPr>
       <w:ind w:left="100" w:leftChars="2100"/>
@@ -4403,6 +4511,7 @@
   <w:style w:type="table" w:styleId="94">
     <w:name w:val="Table 3D effects 1"/>
     <w:basedOn w:val="12"/>
+    <w:qFormat/>
     <w:uiPriority w:val="0"/>
     <w:pPr>
       <w:widowControl w:val="0"/>
@@ -4678,6 +4787,7 @@
   <w:style w:type="table" w:styleId="97">
     <w:name w:val="Table Classic 1"/>
     <w:basedOn w:val="12"/>
+    <w:qFormat/>
     <w:uiPriority w:val="0"/>
     <w:pPr>
       <w:widowControl w:val="0"/>
@@ -5014,6 +5124,7 @@
   <w:style w:type="table" w:styleId="101">
     <w:name w:val="Table Colorful 1"/>
     <w:basedOn w:val="12"/>
+    <w:qFormat/>
     <w:uiPriority w:val="0"/>
     <w:pPr>
       <w:widowControl w:val="0"/>

</xml_diff>